<commit_message>
Update database SQL and add skripsi
</commit_message>
<xml_diff>
--- a/Skripsi_Ilham_Hemaxtiar_Ramadhan_211011700140.docx
+++ b/Skripsi_Ilham_Hemaxtiar_Ramadhan_211011700140.docx
@@ -7153,7 +7153,50 @@
           <w:b/>
           <w:sz w:val="28"/>
         </w:rPr>
-        <w:t xml:space="preserve">  </w:t>
+        <w:t xml:space="preserve"> </w:t>
+      </w:r>
+    </w:p>
+    <w:p>
+      <w:pPr>
+        <w:spacing w:after="568" w:line="259" w:lineRule="auto"/>
+        <w:ind w:left="361" w:firstLine="0"/>
+        <w:jc w:val="center"/>
+      </w:pPr>
+      <w:r>
+        <w:rPr>
+          <w:b/>
+          <w:sz w:val="28"/>
+        </w:rPr>
+        <w:lastRenderedPageBreak/>
+        <w:t xml:space="preserve"> </w:t>
+      </w:r>
+    </w:p>
+    <w:p>
+      <w:pPr>
+        <w:spacing w:after="0" w:line="259" w:lineRule="auto"/>
+        <w:ind w:left="361" w:firstLine="0"/>
+        <w:jc w:val="center"/>
+      </w:pPr>
+      <w:r>
+        <w:rPr>
+          <w:b/>
+          <w:sz w:val="28"/>
+        </w:rPr>
+        <w:t xml:space="preserve"> </w:t>
+      </w:r>
+    </w:p>
+    <w:p>
+      <w:pPr>
+        <w:spacing w:after="568" w:line="259" w:lineRule="auto"/>
+        <w:ind w:left="361" w:firstLine="0"/>
+        <w:jc w:val="center"/>
+      </w:pPr>
+      <w:r>
+        <w:rPr>
+          <w:b/>
+          <w:sz w:val="28"/>
+        </w:rPr>
+        <w:t xml:space="preserve"> </w:t>
       </w:r>
     </w:p>
     <w:p>
@@ -7171,7 +7214,6 @@
           <w:b/>
           <w:sz w:val="28"/>
         </w:rPr>
-        <w:lastRenderedPageBreak/>
         <w:t xml:space="preserve">DAFTAR TABEL </w:t>
       </w:r>
     </w:p>
@@ -7184,7 +7226,6 @@
           <w:rPr>
             <w:rStyle w:val="Hyperlink"/>
             <w:color w:val="auto"/>
-            <w:u w:val="none"/>
             <w:lang w:val="en-US"/>
           </w:rPr>
           <w:t xml:space="preserve">Table 2.1 </w:t>
@@ -7241,7 +7282,6 @@
           <w:rPr>
             <w:rStyle w:val="Hyperlink"/>
             <w:color w:val="auto"/>
-            <w:u w:val="none"/>
             <w:lang w:val="en-US"/>
           </w:rPr>
           <w:t xml:space="preserve">Table 2.2.8 </w:t>
@@ -7298,7 +7338,6 @@
           <w:rPr>
             <w:rStyle w:val="Hyperlink"/>
             <w:color w:val="auto"/>
-            <w:u w:val="none"/>
             <w:lang w:val="en-US"/>
           </w:rPr>
           <w:t>Table 2.2.9</w:t>
@@ -7355,7 +7394,6 @@
           <w:rPr>
             <w:rStyle w:val="Hyperlink"/>
             <w:color w:val="auto"/>
-            <w:u w:val="none"/>
             <w:lang w:val="en-US"/>
           </w:rPr>
           <w:t>Table 2.2.10</w:t>
@@ -7412,7 +7450,6 @@
           <w:rPr>
             <w:rStyle w:val="Hyperlink"/>
             <w:color w:val="auto"/>
-            <w:u w:val="none"/>
             <w:lang w:val="en-US"/>
           </w:rPr>
           <w:t>Table 2.2.11</w:t>
@@ -7469,7 +7506,6 @@
           <w:rPr>
             <w:rStyle w:val="Hyperlink"/>
             <w:color w:val="auto"/>
-            <w:u w:val="none"/>
             <w:lang w:val="en-US"/>
           </w:rPr>
           <w:t>Table 2.2.12</w:t>
@@ -7526,7 +7562,6 @@
           <w:rPr>
             <w:rStyle w:val="Hyperlink"/>
             <w:color w:val="auto"/>
-            <w:u w:val="none"/>
             <w:lang w:val="en-US"/>
           </w:rPr>
           <w:t>Table 2.2.13</w:t>
@@ -7583,7 +7618,6 @@
           <w:rPr>
             <w:rStyle w:val="Hyperlink"/>
             <w:color w:val="auto"/>
-            <w:u w:val="none"/>
             <w:lang w:val="en-US"/>
           </w:rPr>
           <w:t>Table 4.1</w:t>
@@ -7640,7 +7674,6 @@
           <w:rPr>
             <w:rStyle w:val="Hyperlink"/>
             <w:color w:val="auto"/>
-            <w:u w:val="none"/>
             <w:lang w:val="en-US"/>
           </w:rPr>
           <w:t>Table 4.2</w:t>
@@ -7732,598 +7765,14 @@
         <w:spacing w:after="563" w:line="265" w:lineRule="auto"/>
         <w:ind w:left="10"/>
         <w:jc w:val="center"/>
+      </w:pPr>
+      <w:r>
         <w:rPr>
           <w:b/>
           <w:sz w:val="28"/>
         </w:rPr>
-      </w:pPr>
-    </w:p>
-    <w:p>
-      <w:pPr>
-        <w:spacing w:after="563" w:line="265" w:lineRule="auto"/>
-        <w:ind w:left="10"/>
-        <w:jc w:val="center"/>
-        <w:rPr>
-          <w:b/>
-          <w:sz w:val="28"/>
-        </w:rPr>
-      </w:pPr>
-    </w:p>
-    <w:p>
-      <w:pPr>
-        <w:spacing w:after="563" w:line="265" w:lineRule="auto"/>
-        <w:ind w:left="10"/>
-        <w:jc w:val="center"/>
-        <w:rPr>
-          <w:b/>
-          <w:sz w:val="28"/>
-        </w:rPr>
-      </w:pPr>
-    </w:p>
-    <w:p>
-      <w:pPr>
-        <w:spacing w:after="563" w:line="265" w:lineRule="auto"/>
-        <w:ind w:left="10"/>
-        <w:jc w:val="center"/>
-        <w:rPr>
-          <w:b/>
-          <w:sz w:val="28"/>
-        </w:rPr>
-      </w:pPr>
-    </w:p>
-    <w:p>
-      <w:pPr>
-        <w:spacing w:after="563" w:line="265" w:lineRule="auto"/>
-        <w:ind w:left="10"/>
-        <w:jc w:val="center"/>
-        <w:rPr>
-          <w:b/>
-          <w:sz w:val="28"/>
-        </w:rPr>
-      </w:pPr>
-    </w:p>
-    <w:p>
-      <w:pPr>
-        <w:spacing w:after="563" w:line="265" w:lineRule="auto"/>
-        <w:ind w:left="10"/>
-        <w:jc w:val="center"/>
-        <w:rPr>
-          <w:b/>
-          <w:sz w:val="28"/>
-        </w:rPr>
-      </w:pPr>
-    </w:p>
-    <w:p>
-      <w:pPr>
-        <w:spacing w:after="563" w:line="265" w:lineRule="auto"/>
-        <w:ind w:left="10"/>
-        <w:jc w:val="center"/>
-        <w:rPr>
-          <w:b/>
-          <w:sz w:val="28"/>
-        </w:rPr>
-      </w:pPr>
-    </w:p>
-    <w:p>
-      <w:pPr>
-        <w:spacing w:after="563" w:line="265" w:lineRule="auto"/>
-        <w:ind w:left="10"/>
-        <w:jc w:val="center"/>
-        <w:rPr>
-          <w:b/>
-          <w:sz w:val="28"/>
-        </w:rPr>
-      </w:pPr>
-    </w:p>
-    <w:p>
-      <w:pPr>
-        <w:spacing w:after="563" w:line="265" w:lineRule="auto"/>
-        <w:ind w:left="10"/>
-        <w:jc w:val="center"/>
-        <w:rPr>
-          <w:b/>
-          <w:sz w:val="28"/>
-        </w:rPr>
-      </w:pPr>
-    </w:p>
-    <w:p>
-      <w:pPr>
-        <w:spacing w:after="563" w:line="265" w:lineRule="auto"/>
-        <w:ind w:left="10"/>
-        <w:jc w:val="center"/>
-      </w:pPr>
-      <w:r>
-        <w:rPr>
-          <w:b/>
-          <w:sz w:val="28"/>
-        </w:rPr>
-        <w:lastRenderedPageBreak/>
         <w:t>DAFTAR GAMBAR</w:t>
       </w:r>
-    </w:p>
-    <w:p>
-      <w:pPr>
-        <w:pStyle w:val="TOC1"/>
-        <w:rPr>
-          <w:lang w:val="en-US"/>
-        </w:rPr>
-      </w:pPr>
-      <w:hyperlink w:anchor="_Toc235282762" w:history="1">
-        <w:r>
-          <w:rPr>
-            <w:rStyle w:val="Hyperlink"/>
-            <w:color w:val="auto"/>
-            <w:u w:val="none"/>
-            <w:lang w:val="en-US"/>
-          </w:rPr>
-          <w:t>Gambar</w:t>
-        </w:r>
-        <w:r>
-          <w:rPr>
-            <w:rStyle w:val="Hyperlink"/>
-            <w:color w:val="auto"/>
-            <w:u w:val="none"/>
-            <w:lang w:val="en-US"/>
-          </w:rPr>
-          <w:t xml:space="preserve"> </w:t>
-        </w:r>
-        <w:r>
-          <w:rPr>
-            <w:rStyle w:val="Hyperlink"/>
-            <w:color w:val="auto"/>
-            <w:u w:val="none"/>
-            <w:lang w:val="en-US"/>
-          </w:rPr>
-          <w:t>3</w:t>
-        </w:r>
-        <w:r>
-          <w:rPr>
-            <w:rStyle w:val="Hyperlink"/>
-            <w:color w:val="auto"/>
-            <w:u w:val="none"/>
-            <w:lang w:val="en-US"/>
-          </w:rPr>
-          <w:t xml:space="preserve">.1 </w:t>
-        </w:r>
-        <w:r>
-          <w:rPr>
-            <w:webHidden/>
-          </w:rPr>
-          <w:tab/>
-        </w:r>
-        <w:r>
-          <w:rPr>
-            <w:webHidden/>
-          </w:rPr>
-          <w:fldChar w:fldCharType="begin"/>
-        </w:r>
-        <w:r>
-          <w:rPr>
-            <w:webHidden/>
-          </w:rPr>
-          <w:instrText xml:space="preserve"> PAGEREF _Toc235282762 \h </w:instrText>
-        </w:r>
-        <w:r>
-          <w:rPr>
-            <w:webHidden/>
-          </w:rPr>
-        </w:r>
-        <w:r>
-          <w:rPr>
-            <w:webHidden/>
-          </w:rPr>
-          <w:fldChar w:fldCharType="separate"/>
-        </w:r>
-        <w:r>
-          <w:rPr>
-            <w:webHidden/>
-          </w:rPr>
-          <w:t>2</w:t>
-        </w:r>
-        <w:r>
-          <w:rPr>
-            <w:webHidden/>
-          </w:rPr>
-          <w:fldChar w:fldCharType="end"/>
-        </w:r>
-      </w:hyperlink>
-      <w:r>
-        <w:rPr>
-          <w:lang w:val="en-US"/>
-        </w:rPr>
-        <w:t>9</w:t>
-      </w:r>
-    </w:p>
-    <w:p>
-      <w:pPr>
-        <w:pStyle w:val="TOC1"/>
-      </w:pPr>
-      <w:hyperlink w:anchor="_Toc235282762" w:history="1">
-        <w:r>
-          <w:rPr>
-            <w:rStyle w:val="Hyperlink"/>
-            <w:color w:val="auto"/>
-            <w:u w:val="none"/>
-            <w:lang w:val="en-US"/>
-          </w:rPr>
-          <w:t xml:space="preserve">Gambar </w:t>
-        </w:r>
-        <w:r>
-          <w:rPr>
-            <w:rStyle w:val="Hyperlink"/>
-            <w:color w:val="auto"/>
-            <w:u w:val="none"/>
-            <w:lang w:val="en-US"/>
-          </w:rPr>
-          <w:t>3.2</w:t>
-        </w:r>
-        <w:r>
-          <w:rPr>
-            <w:rStyle w:val="Hyperlink"/>
-            <w:color w:val="auto"/>
-            <w:u w:val="none"/>
-            <w:lang w:val="en-US"/>
-          </w:rPr>
-          <w:t xml:space="preserve"> </w:t>
-        </w:r>
-        <w:r>
-          <w:rPr>
-            <w:webHidden/>
-          </w:rPr>
-          <w:tab/>
-        </w:r>
-        <w:r>
-          <w:rPr>
-            <w:webHidden/>
-            <w:lang w:val="en-US"/>
-          </w:rPr>
-          <w:t>3</w:t>
-        </w:r>
-        <w:r>
-          <w:rPr>
-            <w:webHidden/>
-          </w:rPr>
-          <w:fldChar w:fldCharType="begin"/>
-        </w:r>
-        <w:r>
-          <w:rPr>
-            <w:webHidden/>
-          </w:rPr>
-          <w:instrText xml:space="preserve"> PAGEREF _Toc235282762 \h </w:instrText>
-        </w:r>
-        <w:r>
-          <w:rPr>
-            <w:webHidden/>
-          </w:rPr>
-        </w:r>
-        <w:r>
-          <w:rPr>
-            <w:webHidden/>
-          </w:rPr>
-          <w:fldChar w:fldCharType="separate"/>
-        </w:r>
-        <w:r>
-          <w:rPr>
-            <w:webHidden/>
-          </w:rPr>
-          <w:t>2</w:t>
-        </w:r>
-        <w:r>
-          <w:rPr>
-            <w:webHidden/>
-          </w:rPr>
-          <w:fldChar w:fldCharType="end"/>
-        </w:r>
-      </w:hyperlink>
-    </w:p>
-    <w:p>
-      <w:pPr>
-        <w:pStyle w:val="TOC1"/>
-        <w:rPr>
-          <w:lang w:val="en-US"/>
-        </w:rPr>
-      </w:pPr>
-      <w:hyperlink w:anchor="_Toc235282762" w:history="1">
-        <w:r>
-          <w:rPr>
-            <w:rStyle w:val="Hyperlink"/>
-            <w:color w:val="auto"/>
-            <w:u w:val="none"/>
-            <w:lang w:val="en-US"/>
-          </w:rPr>
-          <w:t xml:space="preserve">Gambar </w:t>
-        </w:r>
-        <w:r>
-          <w:rPr>
-            <w:rStyle w:val="Hyperlink"/>
-            <w:color w:val="auto"/>
-            <w:u w:val="none"/>
-            <w:lang w:val="en-US"/>
-          </w:rPr>
-          <w:t>3.4</w:t>
-        </w:r>
-        <w:r>
-          <w:rPr>
-            <w:webHidden/>
-          </w:rPr>
-          <w:tab/>
-        </w:r>
-        <w:r>
-          <w:rPr>
-            <w:webHidden/>
-            <w:lang w:val="en-US"/>
-          </w:rPr>
-          <w:t>3</w:t>
-        </w:r>
-      </w:hyperlink>
-      <w:r>
-        <w:rPr>
-          <w:lang w:val="en-US"/>
-        </w:rPr>
-        <w:t>2</w:t>
-      </w:r>
-    </w:p>
-    <w:p>
-      <w:pPr>
-        <w:pStyle w:val="TOC1"/>
-      </w:pPr>
-      <w:hyperlink w:anchor="_Toc235282762" w:history="1">
-        <w:r>
-          <w:rPr>
-            <w:rStyle w:val="Hyperlink"/>
-            <w:color w:val="auto"/>
-            <w:u w:val="none"/>
-            <w:lang w:val="en-US"/>
-          </w:rPr>
-          <w:t xml:space="preserve">Gambar </w:t>
-        </w:r>
-        <w:r>
-          <w:rPr>
-            <w:rStyle w:val="Hyperlink"/>
-            <w:color w:val="auto"/>
-            <w:u w:val="none"/>
-            <w:lang w:val="en-US"/>
-          </w:rPr>
-          <w:t>3.5</w:t>
-        </w:r>
-        <w:r>
-          <w:rPr>
-            <w:webHidden/>
-          </w:rPr>
-          <w:tab/>
-        </w:r>
-        <w:r>
-          <w:rPr>
-            <w:webHidden/>
-            <w:lang w:val="en-US"/>
-          </w:rPr>
-          <w:t>33</w:t>
-        </w:r>
-      </w:hyperlink>
-    </w:p>
-    <w:p>
-      <w:pPr>
-        <w:pStyle w:val="TOC1"/>
-      </w:pPr>
-      <w:hyperlink w:anchor="_Toc235282762" w:history="1">
-        <w:r>
-          <w:rPr>
-            <w:rStyle w:val="Hyperlink"/>
-            <w:color w:val="auto"/>
-            <w:u w:val="none"/>
-            <w:lang w:val="en-US"/>
-          </w:rPr>
-          <w:t xml:space="preserve">Halaman </w:t>
-        </w:r>
-        <w:r>
-          <w:rPr>
-            <w:rStyle w:val="Hyperlink"/>
-            <w:color w:val="auto"/>
-            <w:u w:val="none"/>
-            <w:lang w:val="en-US"/>
-          </w:rPr>
-          <w:t>desain interface</w:t>
-        </w:r>
-        <w:r>
-          <w:rPr>
-            <w:webHidden/>
-          </w:rPr>
-          <w:tab/>
-        </w:r>
-        <w:r>
-          <w:rPr>
-            <w:webHidden/>
-            <w:lang w:val="en-US"/>
-          </w:rPr>
-          <w:t>33</w:t>
-        </w:r>
-      </w:hyperlink>
-    </w:p>
-    <w:p>
-      <w:pPr>
-        <w:pStyle w:val="TOC1"/>
-      </w:pPr>
-      <w:hyperlink w:anchor="_Toc235282762" w:history="1">
-        <w:r>
-          <w:rPr>
-            <w:rStyle w:val="Hyperlink"/>
-            <w:color w:val="auto"/>
-            <w:u w:val="none"/>
-            <w:lang w:val="en-US"/>
-          </w:rPr>
-          <w:t>gambar implementasi halaman Login</w:t>
-        </w:r>
-        <w:r>
-          <w:rPr>
-            <w:webHidden/>
-          </w:rPr>
-          <w:tab/>
-        </w:r>
-        <w:r>
-          <w:rPr>
-            <w:webHidden/>
-            <w:lang w:val="en-US"/>
-          </w:rPr>
-          <w:t>35</w:t>
-        </w:r>
-      </w:hyperlink>
-    </w:p>
-    <w:p>
-      <w:pPr>
-        <w:pStyle w:val="TOC1"/>
-      </w:pPr>
-      <w:hyperlink w:anchor="_Toc235282762" w:history="1">
-        <w:r>
-          <w:rPr>
-            <w:rStyle w:val="Hyperlink"/>
-            <w:color w:val="auto"/>
-            <w:u w:val="none"/>
-            <w:lang w:val="en-US"/>
-          </w:rPr>
-          <w:t>gambar implementasi halaman dashboard</w:t>
-        </w:r>
-        <w:r>
-          <w:rPr>
-            <w:webHidden/>
-          </w:rPr>
-          <w:tab/>
-        </w:r>
-        <w:r>
-          <w:rPr>
-            <w:webHidden/>
-            <w:lang w:val="en-US"/>
-          </w:rPr>
-          <w:t>35</w:t>
-        </w:r>
-      </w:hyperlink>
-    </w:p>
-    <w:p>
-      <w:pPr>
-        <w:pStyle w:val="TOC1"/>
-      </w:pPr>
-      <w:hyperlink w:anchor="_Toc235282762" w:history="1">
-        <w:r>
-          <w:rPr>
-            <w:rStyle w:val="Hyperlink"/>
-            <w:color w:val="auto"/>
-            <w:u w:val="none"/>
-            <w:lang w:val="en-US"/>
-          </w:rPr>
-          <w:t>gambar implementasi upload dokumen</w:t>
-        </w:r>
-        <w:r>
-          <w:rPr>
-            <w:webHidden/>
-          </w:rPr>
-          <w:tab/>
-        </w:r>
-        <w:r>
-          <w:rPr>
-            <w:webHidden/>
-            <w:lang w:val="en-US"/>
-          </w:rPr>
-          <w:t>36</w:t>
-        </w:r>
-      </w:hyperlink>
-    </w:p>
-    <w:p>
-      <w:pPr>
-        <w:pStyle w:val="TOC1"/>
-      </w:pPr>
-      <w:hyperlink w:anchor="_Toc235282762" w:history="1">
-        <w:r>
-          <w:rPr>
-            <w:rStyle w:val="Hyperlink"/>
-            <w:color w:val="auto"/>
-            <w:u w:val="none"/>
-            <w:lang w:val="en-US"/>
-          </w:rPr>
-          <w:t>gambar implementasi perkara</w:t>
-        </w:r>
-        <w:r>
-          <w:rPr>
-            <w:webHidden/>
-          </w:rPr>
-          <w:tab/>
-        </w:r>
-        <w:r>
-          <w:rPr>
-            <w:webHidden/>
-            <w:lang w:val="en-US"/>
-          </w:rPr>
-          <w:t>36</w:t>
-        </w:r>
-      </w:hyperlink>
-    </w:p>
-    <w:p>
-      <w:pPr>
-        <w:pStyle w:val="TOC1"/>
-      </w:pPr>
-      <w:hyperlink w:anchor="_Toc235282762" w:history="1">
-        <w:r>
-          <w:rPr>
-            <w:rStyle w:val="Hyperlink"/>
-            <w:color w:val="auto"/>
-            <w:u w:val="none"/>
-            <w:lang w:val="en-US"/>
-          </w:rPr>
-          <w:t>gambar implementasi kelola kategori dan data kasus</w:t>
-        </w:r>
-        <w:r>
-          <w:rPr>
-            <w:webHidden/>
-          </w:rPr>
-          <w:tab/>
-        </w:r>
-        <w:r>
-          <w:rPr>
-            <w:webHidden/>
-            <w:lang w:val="en-US"/>
-          </w:rPr>
-          <w:t>37</w:t>
-        </w:r>
-      </w:hyperlink>
-    </w:p>
-    <w:p>
-      <w:pPr>
-        <w:pStyle w:val="TOC1"/>
-      </w:pPr>
-      <w:hyperlink w:anchor="_Toc235282762" w:history="1">
-        <w:r>
-          <w:rPr>
-            <w:rStyle w:val="Hyperlink"/>
-            <w:color w:val="auto"/>
-            <w:u w:val="none"/>
-            <w:lang w:val="en-US"/>
-          </w:rPr>
-          <w:t>gambar implementasi laporan</w:t>
-        </w:r>
-        <w:r>
-          <w:rPr>
-            <w:webHidden/>
-          </w:rPr>
-          <w:tab/>
-        </w:r>
-        <w:r>
-          <w:rPr>
-            <w:webHidden/>
-            <w:lang w:val="en-US"/>
-          </w:rPr>
-          <w:t>37</w:t>
-        </w:r>
-      </w:hyperlink>
-    </w:p>
-    <w:p>
-      <w:pPr>
-        <w:spacing w:after="563" w:line="265" w:lineRule="auto"/>
-        <w:ind w:left="10"/>
-      </w:pPr>
-    </w:p>
-    <w:p>
-      <w:pPr>
-        <w:spacing w:after="563" w:line="265" w:lineRule="auto"/>
-        <w:ind w:left="10"/>
-      </w:pPr>
     </w:p>
     <w:p>
       <w:pPr>
@@ -8341,6 +7790,20 @@
     </w:p>
     <w:p>
       <w:pPr>
+        <w:spacing w:after="568" w:line="259" w:lineRule="auto"/>
+        <w:ind w:left="361" w:firstLine="0"/>
+        <w:jc w:val="center"/>
+      </w:pPr>
+      <w:r>
+        <w:rPr>
+          <w:b/>
+          <w:sz w:val="28"/>
+        </w:rPr>
+        <w:t xml:space="preserve"> </w:t>
+      </w:r>
+    </w:p>
+    <w:p>
+      <w:pPr>
         <w:spacing w:after="570" w:line="259" w:lineRule="auto"/>
         <w:ind w:left="361" w:firstLine="0"/>
         <w:jc w:val="center"/>
@@ -8420,6 +7883,7 @@
           <w:b/>
           <w:sz w:val="28"/>
         </w:rPr>
+        <w:lastRenderedPageBreak/>
         <w:t xml:space="preserve"> </w:t>
       </w:r>
     </w:p>
@@ -8439,12 +7903,45 @@
     </w:p>
     <w:p>
       <w:pPr>
+        <w:spacing w:after="570" w:line="259" w:lineRule="auto"/>
+        <w:ind w:left="283" w:firstLine="0"/>
+        <w:jc w:val="left"/>
+      </w:pPr>
+      <w:r>
+        <w:rPr>
+          <w:b/>
+          <w:sz w:val="28"/>
+        </w:rPr>
+        <w:t xml:space="preserve"> </w:t>
+      </w:r>
+    </w:p>
+    <w:p>
+      <w:pPr>
+        <w:spacing w:after="568" w:line="259" w:lineRule="auto"/>
+        <w:ind w:left="283" w:firstLine="0"/>
+        <w:jc w:val="left"/>
+      </w:pPr>
+      <w:r>
+        <w:rPr>
+          <w:b/>
+          <w:sz w:val="28"/>
+        </w:rPr>
+        <w:t xml:space="preserve"> </w:t>
+      </w:r>
+      <w:r>
+        <w:rPr>
+          <w:b/>
+        </w:rPr>
+        <w:t xml:space="preserve"> </w:t>
+      </w:r>
+    </w:p>
+    <w:p>
+      <w:pPr>
         <w:pStyle w:val="Heading1"/>
         <w:ind w:left="794" w:right="492"/>
       </w:pPr>
       <w:bookmarkStart w:id="9" w:name="_Toc235282768"/>
       <w:r>
-        <w:lastRenderedPageBreak/>
         <w:t>BAB I</w:t>
       </w:r>
       <w:r>
@@ -8547,7 +8044,11 @@
         <w:ind w:left="859" w:right="104" w:firstLine="566"/>
       </w:pPr>
       <w:r>
-        <w:t xml:space="preserve">Dokumen yang terstruktur dan terorganisir dengan baik dapat meningkatkan efisiensi kerja,mempermudah akses informasi dan mendukung pengambilan keputusan dengan sangat baik.Dengan perkembangan teknologi saat ini,metode perancangan sistem yang efektif sangat diperlukan untuk memenuhi kebutuhan pengguna.salah satu pendekatan yang digunakan dalam pengembangan sistem kali ini ialah metode prototyping.metode ini memungkinkan pengembang untuk membuat model awal dari sistem yang akan dibangun,sehingga pengguna dapat langsung memberikan umpan balik.prototype ini berfungsi sebagai alat komunikasi antara pengembang dan pengguna,dan memungkinkan perbaikan dan pemeliharaan secara berkelanjutan. </w:t>
+        <w:t xml:space="preserve">Dokumen yang terstruktur dan terorganisir dengan baik dapat meningkatkan efisiensi kerja,mempermudah akses informasi dan mendukung pengambilan keputusan dengan sangat baik.Dengan perkembangan teknologi saat ini,metode perancangan sistem yang efektif sangat diperlukan untuk memenuhi kebutuhan pengguna.salah satu pendekatan yang digunakan dalam pengembangan sistem kali ini ialah metode prototyping.metode ini memungkinkan pengembang untuk membuat model awal dari sistem yang akan dibangun,sehingga pengguna dapat langsung memberikan umpan balik.prototype ini berfungsi sebagai alat komunikasi </w:t>
+      </w:r>
+      <w:r>
+        <w:lastRenderedPageBreak/>
+        <w:t xml:space="preserve">antara pengembang dan pengguna,dan memungkinkan perbaikan dan pemeliharaan secara berkelanjutan. </w:t>
       </w:r>
     </w:p>
     <w:p>
@@ -9738,11 +9239,18 @@
     <w:p/>
     <w:p/>
     <w:p/>
-    <w:p>
-      <w:pPr>
-        <w:ind w:left="0" w:firstLine="0"/>
-      </w:pPr>
-    </w:p>
+    <w:p/>
+    <w:p/>
+    <w:p/>
+    <w:p/>
+    <w:p/>
+    <w:p/>
+    <w:p/>
+    <w:p/>
+    <w:p/>
+    <w:p/>
+    <w:p/>
+    <w:p/>
     <w:p>
       <w:pPr>
         <w:pStyle w:val="Heading1"/>
@@ -9750,7 +9258,6 @@
       </w:pPr>
       <w:bookmarkStart w:id="17" w:name="_Toc235282776"/>
       <w:r>
-        <w:lastRenderedPageBreak/>
         <w:t>BAB II TINJAUAN PUSTAKA</w:t>
       </w:r>
       <w:bookmarkEnd w:id="17"/>
@@ -9902,7 +9409,11 @@
         <w:ind w:right="191" w:hanging="360"/>
       </w:pPr>
       <w:r>
-        <w:t xml:space="preserve">Pada penelitian (putu ayu baskara,2023) Perancangan sistem pengelola arsip keluarga bertujuan untuk memudahkan pengelolaan arsip keluarga.Metode yang digunakan dalam penelitian ini adalah CRUD.Hasilya ialah sistem pengelola arsip keluarga Berbasis Website Dalam Upaya Pelestarian Arsip. </w:t>
+        <w:t xml:space="preserve">Pada penelitian (putu ayu baskara,2023) Perancangan sistem pengelola arsip keluarga bertujuan untuk memudahkan pengelolaan arsip keluarga.Metode </w:t>
+      </w:r>
+      <w:r>
+        <w:lastRenderedPageBreak/>
+        <w:t xml:space="preserve">yang digunakan dalam penelitian ini adalah CRUD.Hasilya ialah sistem pengelola arsip keluarga Berbasis Website Dalam Upaya Pelestarian Arsip. </w:t>
       </w:r>
     </w:p>
     <w:p>
@@ -10013,7 +9524,6 @@
               <w:ind w:left="0" w:firstLine="0"/>
             </w:pPr>
             <w:r>
-              <w:lastRenderedPageBreak/>
               <w:t xml:space="preserve">No </w:t>
             </w:r>
           </w:p>
@@ -10799,6 +10309,7 @@
               <w:jc w:val="left"/>
             </w:pPr>
             <w:r>
+              <w:lastRenderedPageBreak/>
               <w:t xml:space="preserve">5 </w:t>
             </w:r>
           </w:p>
@@ -15251,10 +14762,1069 @@
           <w:noProof/>
         </w:rPr>
         <w:drawing>
-          <wp:inline distT="0" distB="0" distL="0" distR="0" wp14:anchorId="029B9124" wp14:editId="251BBBD1">
-            <wp:extent cx="4559534" cy="2825895"/>
+          <wp:inline distT="0" distB="0" distL="0" distR="0" wp14:anchorId="4714ACCC" wp14:editId="5C43B1B9">
+            <wp:extent cx="2476500" cy="3115310"/>
+            <wp:effectExtent l="0" t="0" r="0" b="8890"/>
+            <wp:docPr id="2" name="Picture 2"/>
+            <wp:cNvGraphicFramePr>
+              <a:graphicFrameLocks xmlns:a="http://schemas.openxmlformats.org/drawingml/2006/main" noChangeAspect="1"/>
+            </wp:cNvGraphicFramePr>
+            <a:graphic xmlns:a="http://schemas.openxmlformats.org/drawingml/2006/main">
+              <a:graphicData uri="http://schemas.openxmlformats.org/drawingml/2006/picture">
+                <pic:pic xmlns:pic="http://schemas.openxmlformats.org/drawingml/2006/picture">
+                  <pic:nvPicPr>
+                    <pic:cNvPr id="1" name=""/>
+                    <pic:cNvPicPr/>
+                  </pic:nvPicPr>
+                  <pic:blipFill rotWithShape="1">
+                    <a:blip r:embed="rId44"/>
+                    <a:srcRect r="15017"/>
+                    <a:stretch/>
+                  </pic:blipFill>
+                  <pic:spPr bwMode="auto">
+                    <a:xfrm>
+                      <a:off x="0" y="0"/>
+                      <a:ext cx="2484085" cy="3124852"/>
+                    </a:xfrm>
+                    <a:prstGeom prst="rect">
+                      <a:avLst/>
+                    </a:prstGeom>
+                    <a:ln>
+                      <a:noFill/>
+                    </a:ln>
+                    <a:extLst>
+                      <a:ext uri="{53640926-AAD7-44D8-BBD7-CCE9431645EC}">
+                        <a14:shadowObscured xmlns:a14="http://schemas.microsoft.com/office/drawing/2010/main"/>
+                      </a:ext>
+                    </a:extLst>
+                  </pic:spPr>
+                </pic:pic>
+              </a:graphicData>
+            </a:graphic>
+          </wp:inline>
+        </w:drawing>
+      </w:r>
+    </w:p>
+    <w:p>
+      <w:pPr>
+        <w:ind w:left="715"/>
+      </w:pPr>
+      <w:r>
+        <w:t>b. Halaman Dashboard – menampilkan ringkasan informasi seperti jumlah dokumen, jumlah kasus aktif, dan aktivitas terbaru.</w:t>
+      </w:r>
+    </w:p>
+    <w:p>
+      <w:pPr>
+        <w:ind w:left="715"/>
+      </w:pPr>
+      <w:r>
+        <w:lastRenderedPageBreak/>
+        <w:t>c. Halaman Upload Dokumen – berisi form untuk mengunggah dokumen baru beserta kategori dan kasus terkait.</w:t>
+      </w:r>
+    </w:p>
+    <w:p>
+      <w:pPr>
+        <w:ind w:left="715"/>
+      </w:pPr>
+      <w:r>
+        <w:rPr>
+          <w:noProof/>
+        </w:rPr>
+        <w:drawing>
+          <wp:inline distT="0" distB="0" distL="0" distR="0" wp14:anchorId="0504C9EA" wp14:editId="13AB82EB">
+            <wp:extent cx="5493385" cy="2216785"/>
             <wp:effectExtent l="0" t="0" r="0" b="0"/>
-            <wp:docPr id="10" name="Picture 10"/>
+            <wp:docPr id="3" name="Picture 3"/>
+            <wp:cNvGraphicFramePr>
+              <a:graphicFrameLocks xmlns:a="http://schemas.openxmlformats.org/drawingml/2006/main" noChangeAspect="1"/>
+            </wp:cNvGraphicFramePr>
+            <a:graphic xmlns:a="http://schemas.openxmlformats.org/drawingml/2006/main">
+              <a:graphicData uri="http://schemas.openxmlformats.org/drawingml/2006/picture">
+                <pic:pic xmlns:pic="http://schemas.openxmlformats.org/drawingml/2006/picture">
+                  <pic:nvPicPr>
+                    <pic:cNvPr id="1" name=""/>
+                    <pic:cNvPicPr/>
+                  </pic:nvPicPr>
+                  <pic:blipFill>
+                    <a:blip r:embed="rId45"/>
+                    <a:stretch>
+                      <a:fillRect/>
+                    </a:stretch>
+                  </pic:blipFill>
+                  <pic:spPr>
+                    <a:xfrm>
+                      <a:off x="0" y="0"/>
+                      <a:ext cx="5493385" cy="2216785"/>
+                    </a:xfrm>
+                    <a:prstGeom prst="rect">
+                      <a:avLst/>
+                    </a:prstGeom>
+                  </pic:spPr>
+                </pic:pic>
+              </a:graphicData>
+            </a:graphic>
+          </wp:inline>
+        </w:drawing>
+      </w:r>
+    </w:p>
+    <w:p>
+      <w:pPr>
+        <w:ind w:left="715"/>
+      </w:pPr>
+      <w:r>
+        <w:t>d. Halaman Pencarian/Daftar Dokumen – menampilkan daftar dokumen yang dapat dicari dan difilter berdasarkan kategori, kasus, atau tanggal unggah.</w:t>
+      </w:r>
+    </w:p>
+    <w:p>
+      <w:pPr>
+        <w:ind w:left="715"/>
+      </w:pPr>
+      <w:r>
+        <w:rPr>
+          <w:noProof/>
+        </w:rPr>
+        <w:drawing>
+          <wp:inline distT="0" distB="0" distL="0" distR="0" wp14:anchorId="388E3684" wp14:editId="595A5360">
+            <wp:extent cx="5493385" cy="2729230"/>
+            <wp:effectExtent l="0" t="0" r="0" b="0"/>
+            <wp:docPr id="5" name="Picture 5"/>
+            <wp:cNvGraphicFramePr>
+              <a:graphicFrameLocks xmlns:a="http://schemas.openxmlformats.org/drawingml/2006/main" noChangeAspect="1"/>
+            </wp:cNvGraphicFramePr>
+            <a:graphic xmlns:a="http://schemas.openxmlformats.org/drawingml/2006/main">
+              <a:graphicData uri="http://schemas.openxmlformats.org/drawingml/2006/picture">
+                <pic:pic xmlns:pic="http://schemas.openxmlformats.org/drawingml/2006/picture">
+                  <pic:nvPicPr>
+                    <pic:cNvPr id="1" name=""/>
+                    <pic:cNvPicPr/>
+                  </pic:nvPicPr>
+                  <pic:blipFill>
+                    <a:blip r:embed="rId46"/>
+                    <a:stretch>
+                      <a:fillRect/>
+                    </a:stretch>
+                  </pic:blipFill>
+                  <pic:spPr>
+                    <a:xfrm>
+                      <a:off x="0" y="0"/>
+                      <a:ext cx="5493385" cy="2729230"/>
+                    </a:xfrm>
+                    <a:prstGeom prst="rect">
+                      <a:avLst/>
+                    </a:prstGeom>
+                  </pic:spPr>
+                </pic:pic>
+              </a:graphicData>
+            </a:graphic>
+          </wp:inline>
+        </w:drawing>
+      </w:r>
+    </w:p>
+    <w:p>
+      <w:pPr>
+        <w:ind w:left="715"/>
+      </w:pPr>
+      <w:r>
+        <w:t>e. Halaman Kelola Kategori dan Data Kasus – khusus diakses oleh Admin untuk menambah, mengubah, atau menghapus data kategori dan kasus.</w:t>
+      </w:r>
+    </w:p>
+    <w:p>
+      <w:pPr>
+        <w:ind w:left="715"/>
+      </w:pPr>
+      <w:r>
+        <w:rPr>
+          <w:noProof/>
+        </w:rPr>
+        <w:drawing>
+          <wp:inline distT="0" distB="0" distL="0" distR="0" wp14:anchorId="19396314" wp14:editId="2DCAE8D9">
+            <wp:extent cx="5493385" cy="2847975"/>
+            <wp:effectExtent l="0" t="0" r="0" b="9525"/>
+            <wp:docPr id="6" name="Picture 6"/>
+            <wp:cNvGraphicFramePr>
+              <a:graphicFrameLocks xmlns:a="http://schemas.openxmlformats.org/drawingml/2006/main" noChangeAspect="1"/>
+            </wp:cNvGraphicFramePr>
+            <a:graphic xmlns:a="http://schemas.openxmlformats.org/drawingml/2006/main">
+              <a:graphicData uri="http://schemas.openxmlformats.org/drawingml/2006/picture">
+                <pic:pic xmlns:pic="http://schemas.openxmlformats.org/drawingml/2006/picture">
+                  <pic:nvPicPr>
+                    <pic:cNvPr id="1" name=""/>
+                    <pic:cNvPicPr/>
+                  </pic:nvPicPr>
+                  <pic:blipFill>
+                    <a:blip r:embed="rId47"/>
+                    <a:stretch>
+                      <a:fillRect/>
+                    </a:stretch>
+                  </pic:blipFill>
+                  <pic:spPr>
+                    <a:xfrm>
+                      <a:off x="0" y="0"/>
+                      <a:ext cx="5493385" cy="2847975"/>
+                    </a:xfrm>
+                    <a:prstGeom prst="rect">
+                      <a:avLst/>
+                    </a:prstGeom>
+                  </pic:spPr>
+                </pic:pic>
+              </a:graphicData>
+            </a:graphic>
+          </wp:inline>
+        </w:drawing>
+      </w:r>
+    </w:p>
+    <w:p>
+      <w:pPr>
+        <w:spacing w:after="72" w:line="259" w:lineRule="auto"/>
+        <w:ind w:left="214" w:firstLine="0"/>
+        <w:jc w:val="left"/>
+      </w:pPr>
+    </w:p>
+    <w:p>
+      <w:pPr>
+        <w:pStyle w:val="Heading1"/>
+        <w:rPr>
+          <w:lang w:val="en-US"/>
+        </w:rPr>
+      </w:pPr>
+      <w:bookmarkStart w:id="42" w:name="_Toc235282798"/>
+      <w:r>
+        <w:rPr>
+          <w:lang w:val="en-US"/>
+        </w:rPr>
+        <w:t>BAB IV</w:t>
+      </w:r>
+      <w:bookmarkEnd w:id="42"/>
+      <w:r>
+        <w:rPr>
+          <w:lang w:val="en-US"/>
+        </w:rPr>
+        <w:t xml:space="preserve"> </w:t>
+      </w:r>
+    </w:p>
+    <w:p>
+      <w:pPr>
+        <w:rPr>
+          <w:b/>
+          <w:lang w:val="en-US"/>
+        </w:rPr>
+      </w:pPr>
+      <w:r>
+        <w:rPr>
+          <w:b/>
+          <w:lang w:val="en-US"/>
+        </w:rPr>
+        <w:tab/>
+      </w:r>
+      <w:r>
+        <w:rPr>
+          <w:b/>
+          <w:lang w:val="en-US"/>
+        </w:rPr>
+        <w:tab/>
+      </w:r>
+      <w:r>
+        <w:rPr>
+          <w:b/>
+          <w:lang w:val="en-US"/>
+        </w:rPr>
+        <w:tab/>
+      </w:r>
+      <w:r>
+        <w:rPr>
+          <w:b/>
+          <w:lang w:val="en-US"/>
+        </w:rPr>
+        <w:tab/>
+        <w:t xml:space="preserve">     IMPLEMENTASI DAN PENGUJIAN</w:t>
+      </w:r>
+    </w:p>
+    <w:p>
+      <w:pPr>
+        <w:pStyle w:val="Heading2"/>
+        <w:rPr>
+          <w:lang w:val="en-US"/>
+        </w:rPr>
+      </w:pPr>
+      <w:bookmarkStart w:id="43" w:name="_Toc235282799"/>
+      <w:r>
+        <w:rPr>
+          <w:lang w:val="en-US"/>
+        </w:rPr>
+        <w:t>4.1 Implementasi</w:t>
+      </w:r>
+      <w:bookmarkEnd w:id="43"/>
+    </w:p>
+    <w:p>
+      <w:pPr>
+        <w:rPr>
+          <w:lang w:val="en-US"/>
+        </w:rPr>
+      </w:pPr>
+      <w:r>
+        <w:t>Tahap implementasi merupakan tahap dari kelanjutan perancangan sistem yang sudah dibuat sebelumnya. Hasil dari tahap ini yaitu sebuah sistem yang nantinya siap untuk digunakan dan diuji.</w:t>
+      </w:r>
+    </w:p>
+    <w:p>
+      <w:pPr>
+        <w:pStyle w:val="Heading3"/>
+        <w:rPr>
+          <w:i w:val="0"/>
+          <w:iCs/>
+          <w:lang w:val="en-US"/>
+        </w:rPr>
+      </w:pPr>
+      <w:r>
+        <w:rPr>
+          <w:lang w:val="en-US"/>
+        </w:rPr>
+        <w:tab/>
+      </w:r>
+      <w:r>
+        <w:rPr>
+          <w:lang w:val="en-US"/>
+        </w:rPr>
+        <w:tab/>
+      </w:r>
+      <w:bookmarkStart w:id="44" w:name="_Toc235282800"/>
+      <w:r>
+        <w:rPr>
+          <w:i w:val="0"/>
+          <w:iCs/>
+          <w:lang w:val="en-US"/>
+        </w:rPr>
+        <w:t>4.1.1 Implementasi Perangkat Keras</w:t>
+      </w:r>
+      <w:bookmarkEnd w:id="44"/>
+    </w:p>
+    <w:p>
+      <w:r>
+        <w:t xml:space="preserve">Perangkat keras yang digunakan dalam pembuatan aplikasi sistem informasi pada </w:t>
+      </w:r>
+      <w:r>
+        <w:rPr>
+          <w:lang w:val="en-US"/>
+        </w:rPr>
+        <w:t>ODS Law Firm</w:t>
+      </w:r>
+      <w:r>
+        <w:t xml:space="preserve"> adalah komputer personal dengan spesifikasi berikut:</w:t>
+      </w:r>
+    </w:p>
+    <w:p>
+      <w:pPr>
+        <w:jc w:val="center"/>
+      </w:pPr>
+      <w:r>
+        <w:t>Tabel 4.1</w:t>
+      </w:r>
+      <w:r>
+        <w:rPr>
+          <w:lang w:val="en-US"/>
+        </w:rPr>
+        <w:t>.1</w:t>
+      </w:r>
+      <w:r>
+        <w:t xml:space="preserve"> Spesifikasi Implementasi Perangkat Keras (Hardware)</w:t>
+      </w:r>
+    </w:p>
+    <w:tbl>
+      <w:tblPr>
+        <w:tblStyle w:val="TableGrid0"/>
+        <w:tblW w:w="0" w:type="auto"/>
+        <w:tblInd w:w="425" w:type="dxa"/>
+        <w:tblLook w:val="04A0" w:firstRow="1" w:lastRow="0" w:firstColumn="1" w:lastColumn="0" w:noHBand="0" w:noVBand="1"/>
+      </w:tblPr>
+      <w:tblGrid>
+        <w:gridCol w:w="510"/>
+        <w:gridCol w:w="4956"/>
+        <w:gridCol w:w="2750"/>
+      </w:tblGrid>
+      <w:tr>
+        <w:tc>
+          <w:tcPr>
+            <w:tcW w:w="470" w:type="dxa"/>
+          </w:tcPr>
+          <w:p>
+            <w:pPr>
+              <w:ind w:left="0" w:firstLine="0"/>
+              <w:rPr>
+                <w:lang w:val="en-US"/>
+              </w:rPr>
+            </w:pPr>
+            <w:r>
+              <w:rPr>
+                <w:lang w:val="en-US"/>
+              </w:rPr>
+              <w:t>No</w:t>
+            </w:r>
+          </w:p>
+        </w:tc>
+        <w:tc>
+          <w:tcPr>
+            <w:tcW w:w="4985" w:type="dxa"/>
+          </w:tcPr>
+          <w:p>
+            <w:pPr>
+              <w:ind w:left="0" w:firstLine="0"/>
+              <w:rPr>
+                <w:lang w:val="en-US"/>
+              </w:rPr>
+            </w:pPr>
+            <w:r>
+              <w:rPr>
+                <w:lang w:val="en-US"/>
+              </w:rPr>
+              <w:t>Perangkat Keras</w:t>
+            </w:r>
+          </w:p>
+        </w:tc>
+        <w:tc>
+          <w:tcPr>
+            <w:tcW w:w="2761" w:type="dxa"/>
+          </w:tcPr>
+          <w:p>
+            <w:pPr>
+              <w:ind w:left="0" w:firstLine="0"/>
+              <w:rPr>
+                <w:lang w:val="en-US"/>
+              </w:rPr>
+            </w:pPr>
+            <w:r>
+              <w:rPr>
+                <w:lang w:val="en-US"/>
+              </w:rPr>
+              <w:t>Spesifikasi</w:t>
+            </w:r>
+          </w:p>
+        </w:tc>
+      </w:tr>
+      <w:tr>
+        <w:tc>
+          <w:tcPr>
+            <w:tcW w:w="470" w:type="dxa"/>
+          </w:tcPr>
+          <w:p>
+            <w:pPr>
+              <w:ind w:left="0" w:firstLine="0"/>
+              <w:rPr>
+                <w:lang w:val="en-US"/>
+              </w:rPr>
+            </w:pPr>
+            <w:r>
+              <w:rPr>
+                <w:lang w:val="en-US"/>
+              </w:rPr>
+              <w:t>1</w:t>
+            </w:r>
+          </w:p>
+        </w:tc>
+        <w:tc>
+          <w:tcPr>
+            <w:tcW w:w="4985" w:type="dxa"/>
+          </w:tcPr>
+          <w:p>
+            <w:pPr>
+              <w:ind w:left="0" w:firstLine="0"/>
+              <w:rPr>
+                <w:lang w:val="en-US"/>
+              </w:rPr>
+            </w:pPr>
+            <w:r>
+              <w:t>Processor</w:t>
+            </w:r>
+          </w:p>
+        </w:tc>
+        <w:tc>
+          <w:tcPr>
+            <w:tcW w:w="2761" w:type="dxa"/>
+          </w:tcPr>
+          <w:p>
+            <w:pPr>
+              <w:ind w:left="0" w:firstLine="0"/>
+              <w:rPr>
+                <w:lang w:val="en-US"/>
+              </w:rPr>
+            </w:pPr>
+            <w:r>
+              <w:rPr>
+                <w:lang w:val="en-US"/>
+              </w:rPr>
+              <w:t>Intel core i7</w:t>
+            </w:r>
+          </w:p>
+        </w:tc>
+      </w:tr>
+      <w:tr>
+        <w:tc>
+          <w:tcPr>
+            <w:tcW w:w="470" w:type="dxa"/>
+          </w:tcPr>
+          <w:p>
+            <w:pPr>
+              <w:ind w:left="0" w:firstLine="0"/>
+              <w:rPr>
+                <w:lang w:val="en-US"/>
+              </w:rPr>
+            </w:pPr>
+            <w:r>
+              <w:rPr>
+                <w:lang w:val="en-US"/>
+              </w:rPr>
+              <w:t>2</w:t>
+            </w:r>
+          </w:p>
+        </w:tc>
+        <w:tc>
+          <w:tcPr>
+            <w:tcW w:w="4985" w:type="dxa"/>
+          </w:tcPr>
+          <w:p>
+            <w:pPr>
+              <w:ind w:left="0" w:firstLine="0"/>
+              <w:rPr>
+                <w:lang w:val="en-US"/>
+              </w:rPr>
+            </w:pPr>
+            <w:r>
+              <w:t>Memory RAM</w:t>
+            </w:r>
+          </w:p>
+        </w:tc>
+        <w:tc>
+          <w:tcPr>
+            <w:tcW w:w="2761" w:type="dxa"/>
+          </w:tcPr>
+          <w:p>
+            <w:pPr>
+              <w:ind w:left="0" w:firstLine="0"/>
+              <w:rPr>
+                <w:lang w:val="en-US"/>
+              </w:rPr>
+            </w:pPr>
+            <w:r>
+              <w:rPr>
+                <w:lang w:val="en-US"/>
+              </w:rPr>
+              <w:t>8 GB</w:t>
+            </w:r>
+          </w:p>
+        </w:tc>
+      </w:tr>
+      <w:tr>
+        <w:tc>
+          <w:tcPr>
+            <w:tcW w:w="470" w:type="dxa"/>
+          </w:tcPr>
+          <w:p>
+            <w:pPr>
+              <w:ind w:left="0" w:firstLine="0"/>
+              <w:rPr>
+                <w:lang w:val="en-US"/>
+              </w:rPr>
+            </w:pPr>
+            <w:r>
+              <w:rPr>
+                <w:lang w:val="en-US"/>
+              </w:rPr>
+              <w:t>3</w:t>
+            </w:r>
+          </w:p>
+        </w:tc>
+        <w:tc>
+          <w:tcPr>
+            <w:tcW w:w="4985" w:type="dxa"/>
+          </w:tcPr>
+          <w:p>
+            <w:pPr>
+              <w:ind w:left="0" w:firstLine="0"/>
+              <w:rPr>
+                <w:lang w:val="en-US"/>
+              </w:rPr>
+            </w:pPr>
+            <w:r>
+              <w:t>SSD</w:t>
+            </w:r>
+          </w:p>
+        </w:tc>
+        <w:tc>
+          <w:tcPr>
+            <w:tcW w:w="2761" w:type="dxa"/>
+          </w:tcPr>
+          <w:p>
+            <w:pPr>
+              <w:ind w:left="0" w:firstLine="0"/>
+              <w:rPr>
+                <w:lang w:val="en-US"/>
+              </w:rPr>
+            </w:pPr>
+            <w:r>
+              <w:rPr>
+                <w:lang w:val="en-US"/>
+              </w:rPr>
+              <w:t>256 GB</w:t>
+            </w:r>
+          </w:p>
+        </w:tc>
+      </w:tr>
+    </w:tbl>
+    <w:p>
+      <w:pPr>
+        <w:rPr>
+          <w:lang w:val="en-US"/>
+        </w:rPr>
+      </w:pPr>
+    </w:p>
+    <w:p>
+      <w:pPr>
+        <w:rPr>
+          <w:lang w:val="en-US"/>
+        </w:rPr>
+      </w:pPr>
+    </w:p>
+    <w:p>
+      <w:pPr>
+        <w:pStyle w:val="Heading3"/>
+        <w:rPr>
+          <w:i w:val="0"/>
+          <w:iCs/>
+          <w:lang w:val="en-US"/>
+        </w:rPr>
+      </w:pPr>
+      <w:r>
+        <w:rPr>
+          <w:i w:val="0"/>
+          <w:iCs/>
+          <w:lang w:val="en-US"/>
+        </w:rPr>
+        <w:tab/>
+      </w:r>
+      <w:r>
+        <w:rPr>
+          <w:i w:val="0"/>
+          <w:iCs/>
+          <w:lang w:val="en-US"/>
+        </w:rPr>
+        <w:tab/>
+      </w:r>
+      <w:bookmarkStart w:id="45" w:name="_Toc235282801"/>
+      <w:r>
+        <w:rPr>
+          <w:i w:val="0"/>
+          <w:iCs/>
+          <w:lang w:val="en-US"/>
+        </w:rPr>
+        <w:t>4.1.2 Implementasi Perangkat Lunak</w:t>
+      </w:r>
+      <w:bookmarkEnd w:id="45"/>
+    </w:p>
+    <w:p>
+      <w:r>
+        <w:t>Perangkat lunak yang digunakan untuk mengimplementasikan sistem adalah sebagai berikut :</w:t>
+      </w:r>
+    </w:p>
+    <w:p>
+      <w:pPr>
+        <w:jc w:val="center"/>
+      </w:pPr>
+      <w:r>
+        <w:t>Tabel 4.</w:t>
+      </w:r>
+      <w:r>
+        <w:rPr>
+          <w:lang w:val="en-US"/>
+        </w:rPr>
+        <w:t>1.</w:t>
+      </w:r>
+      <w:r>
+        <w:t>2 Implementasi Perangkat Lunak (Software)</w:t>
+      </w:r>
+    </w:p>
+    <w:tbl>
+      <w:tblPr>
+        <w:tblStyle w:val="TableGrid0"/>
+        <w:tblW w:w="0" w:type="auto"/>
+        <w:tblInd w:w="425" w:type="dxa"/>
+        <w:tblLook w:val="04A0" w:firstRow="1" w:lastRow="0" w:firstColumn="1" w:lastColumn="0" w:noHBand="0" w:noVBand="1"/>
+      </w:tblPr>
+      <w:tblGrid>
+        <w:gridCol w:w="560"/>
+        <w:gridCol w:w="4917"/>
+        <w:gridCol w:w="2739"/>
+      </w:tblGrid>
+      <w:tr>
+        <w:tc>
+          <w:tcPr>
+            <w:tcW w:w="560" w:type="dxa"/>
+          </w:tcPr>
+          <w:p>
+            <w:pPr>
+              <w:ind w:left="0" w:firstLine="0"/>
+              <w:jc w:val="left"/>
+              <w:rPr>
+                <w:lang w:val="en-US"/>
+              </w:rPr>
+            </w:pPr>
+            <w:r>
+              <w:rPr>
+                <w:lang w:val="en-US"/>
+              </w:rPr>
+              <w:t>No</w:t>
+            </w:r>
+          </w:p>
+        </w:tc>
+        <w:tc>
+          <w:tcPr>
+            <w:tcW w:w="4917" w:type="dxa"/>
+          </w:tcPr>
+          <w:p>
+            <w:pPr>
+              <w:ind w:left="0" w:firstLine="0"/>
+              <w:jc w:val="left"/>
+              <w:rPr>
+                <w:lang w:val="en-US"/>
+              </w:rPr>
+            </w:pPr>
+            <w:r>
+              <w:rPr>
+                <w:lang w:val="en-US"/>
+              </w:rPr>
+              <w:t>Perangkat Lunak</w:t>
+            </w:r>
+          </w:p>
+        </w:tc>
+        <w:tc>
+          <w:tcPr>
+            <w:tcW w:w="2739" w:type="dxa"/>
+          </w:tcPr>
+          <w:p>
+            <w:pPr>
+              <w:ind w:left="0" w:firstLine="0"/>
+              <w:jc w:val="left"/>
+              <w:rPr>
+                <w:lang w:val="en-US"/>
+              </w:rPr>
+            </w:pPr>
+            <w:r>
+              <w:t>Keterangan</w:t>
+            </w:r>
+          </w:p>
+        </w:tc>
+      </w:tr>
+      <w:tr>
+        <w:tc>
+          <w:tcPr>
+            <w:tcW w:w="560" w:type="dxa"/>
+          </w:tcPr>
+          <w:p>
+            <w:pPr>
+              <w:ind w:left="0" w:firstLine="0"/>
+              <w:jc w:val="left"/>
+              <w:rPr>
+                <w:lang w:val="en-US"/>
+              </w:rPr>
+            </w:pPr>
+            <w:r>
+              <w:rPr>
+                <w:lang w:val="en-US"/>
+              </w:rPr>
+              <w:t>1</w:t>
+            </w:r>
+          </w:p>
+        </w:tc>
+        <w:tc>
+          <w:tcPr>
+            <w:tcW w:w="4917" w:type="dxa"/>
+          </w:tcPr>
+          <w:p>
+            <w:pPr>
+              <w:ind w:left="0" w:firstLine="0"/>
+              <w:jc w:val="left"/>
+              <w:rPr>
+                <w:lang w:val="en-US"/>
+              </w:rPr>
+            </w:pPr>
+            <w:r>
+              <w:rPr>
+                <w:lang w:val="en-US"/>
+              </w:rPr>
+              <w:t xml:space="preserve">Sistem Operasi </w:t>
+            </w:r>
+          </w:p>
+        </w:tc>
+        <w:tc>
+          <w:tcPr>
+            <w:tcW w:w="2739" w:type="dxa"/>
+          </w:tcPr>
+          <w:p>
+            <w:pPr>
+              <w:ind w:left="0" w:firstLine="0"/>
+              <w:jc w:val="left"/>
+              <w:rPr>
+                <w:lang w:val="en-US"/>
+              </w:rPr>
+            </w:pPr>
+            <w:r>
+              <w:rPr>
+                <w:lang w:val="en-US"/>
+              </w:rPr>
+              <w:t>Win</w:t>
+            </w:r>
+            <w:r>
+              <w:rPr>
+                <w:lang w:val="en-US"/>
+              </w:rPr>
+              <w:t xml:space="preserve"> 10 64 bit</w:t>
+            </w:r>
+          </w:p>
+        </w:tc>
+      </w:tr>
+      <w:tr>
+        <w:tc>
+          <w:tcPr>
+            <w:tcW w:w="560" w:type="dxa"/>
+          </w:tcPr>
+          <w:p>
+            <w:pPr>
+              <w:ind w:left="0" w:firstLine="0"/>
+              <w:jc w:val="left"/>
+              <w:rPr>
+                <w:lang w:val="en-US"/>
+              </w:rPr>
+            </w:pPr>
+            <w:r>
+              <w:rPr>
+                <w:lang w:val="en-US"/>
+              </w:rPr>
+              <w:t>2</w:t>
+            </w:r>
+          </w:p>
+        </w:tc>
+        <w:tc>
+          <w:tcPr>
+            <w:tcW w:w="4917" w:type="dxa"/>
+          </w:tcPr>
+          <w:p>
+            <w:pPr>
+              <w:ind w:left="0" w:firstLine="0"/>
+              <w:jc w:val="left"/>
+              <w:rPr>
+                <w:lang w:val="en-US"/>
+              </w:rPr>
+            </w:pPr>
+            <w:r>
+              <w:rPr>
+                <w:lang w:val="en-US"/>
+              </w:rPr>
+              <w:t>Database</w:t>
+            </w:r>
+          </w:p>
+        </w:tc>
+        <w:tc>
+          <w:tcPr>
+            <w:tcW w:w="2739" w:type="dxa"/>
+          </w:tcPr>
+          <w:p>
+            <w:pPr>
+              <w:ind w:left="0" w:firstLine="0"/>
+              <w:jc w:val="left"/>
+              <w:rPr>
+                <w:lang w:val="en-US"/>
+              </w:rPr>
+            </w:pPr>
+            <w:r>
+              <w:t>MySQL Versi 10.4.14</w:t>
+            </w:r>
+          </w:p>
+        </w:tc>
+      </w:tr>
+      <w:tr>
+        <w:tc>
+          <w:tcPr>
+            <w:tcW w:w="560" w:type="dxa"/>
+          </w:tcPr>
+          <w:p>
+            <w:pPr>
+              <w:ind w:left="0" w:firstLine="0"/>
+              <w:jc w:val="left"/>
+              <w:rPr>
+                <w:lang w:val="en-US"/>
+              </w:rPr>
+            </w:pPr>
+            <w:r>
+              <w:rPr>
+                <w:lang w:val="en-US"/>
+              </w:rPr>
+              <w:t>3</w:t>
+            </w:r>
+          </w:p>
+        </w:tc>
+        <w:tc>
+          <w:tcPr>
+            <w:tcW w:w="4917" w:type="dxa"/>
+          </w:tcPr>
+          <w:p>
+            <w:pPr>
+              <w:ind w:left="0" w:firstLine="0"/>
+              <w:jc w:val="left"/>
+              <w:rPr>
+                <w:lang w:val="en-US"/>
+              </w:rPr>
+            </w:pPr>
+            <w:r>
+              <w:rPr>
+                <w:lang w:val="en-US"/>
+              </w:rPr>
+              <w:t xml:space="preserve">Text Editor </w:t>
+            </w:r>
+          </w:p>
+        </w:tc>
+        <w:tc>
+          <w:tcPr>
+            <w:tcW w:w="2739" w:type="dxa"/>
+          </w:tcPr>
+          <w:p>
+            <w:pPr>
+              <w:ind w:left="0" w:firstLine="0"/>
+              <w:jc w:val="left"/>
+              <w:rPr>
+                <w:lang w:val="en-US"/>
+              </w:rPr>
+            </w:pPr>
+            <w:r>
+              <w:rPr>
+                <w:lang w:val="en-US"/>
+              </w:rPr>
+              <w:t>Vs Code</w:t>
+            </w:r>
+          </w:p>
+        </w:tc>
+      </w:tr>
+      <w:tr>
+        <w:tc>
+          <w:tcPr>
+            <w:tcW w:w="560" w:type="dxa"/>
+          </w:tcPr>
+          <w:p>
+            <w:pPr>
+              <w:ind w:left="0" w:firstLine="0"/>
+              <w:jc w:val="left"/>
+              <w:rPr>
+                <w:lang w:val="en-US"/>
+              </w:rPr>
+            </w:pPr>
+            <w:r>
+              <w:rPr>
+                <w:lang w:val="en-US"/>
+              </w:rPr>
+              <w:t>4</w:t>
+            </w:r>
+          </w:p>
+        </w:tc>
+        <w:tc>
+          <w:tcPr>
+            <w:tcW w:w="4917" w:type="dxa"/>
+          </w:tcPr>
+          <w:p>
+            <w:pPr>
+              <w:ind w:left="0" w:firstLine="0"/>
+              <w:jc w:val="left"/>
+              <w:rPr>
+                <w:lang w:val="en-US"/>
+              </w:rPr>
+            </w:pPr>
+            <w:r>
+              <w:rPr>
+                <w:lang w:val="en-US"/>
+              </w:rPr>
+              <w:t>Programming</w:t>
+            </w:r>
+          </w:p>
+        </w:tc>
+        <w:tc>
+          <w:tcPr>
+            <w:tcW w:w="2739" w:type="dxa"/>
+          </w:tcPr>
+          <w:p>
+            <w:pPr>
+              <w:ind w:left="0" w:firstLine="0"/>
+              <w:jc w:val="left"/>
+              <w:rPr>
+                <w:lang w:val="en-US"/>
+              </w:rPr>
+            </w:pPr>
+            <w:r>
+              <w:rPr>
+                <w:lang w:val="en-US"/>
+              </w:rPr>
+              <w:t>PHP</w:t>
+            </w:r>
+          </w:p>
+        </w:tc>
+      </w:tr>
+    </w:tbl>
+    <w:p>
+      <w:pPr>
+        <w:jc w:val="left"/>
+        <w:rPr>
+          <w:lang w:val="en-US"/>
+        </w:rPr>
+      </w:pPr>
+    </w:p>
+    <w:p>
+      <w:pPr>
+        <w:pStyle w:val="Heading3"/>
+        <w:rPr>
+          <w:i w:val="0"/>
+          <w:iCs/>
+        </w:rPr>
+      </w:pPr>
+      <w:bookmarkStart w:id="46" w:name="_Toc235284001"/>
+      <w:r>
+        <w:rPr>
+          <w:i w:val="0"/>
+          <w:iCs/>
+        </w:rPr>
+        <w:t>4.1.3 Implementasi Antarmuka</w:t>
+      </w:r>
+      <w:bookmarkEnd w:id="46"/>
+    </w:p>
+    <w:p>
+      <w:pPr>
+        <w:ind w:left="715"/>
+      </w:pPr>
+      <w:r>
+        <w:t>Bagian ini menampilkan hasil implementasi antarmuka (interface) Sistem Informasi Pemberkasan pada Law Firm ODS yang telah dibangun sesuai dengan rancangan pada Bab III.</w:t>
+      </w:r>
+    </w:p>
+    <w:p>
+      <w:pPr>
+        <w:ind w:left="715"/>
+      </w:pPr>
+      <w:r>
+        <w:rPr>
+          <w:b/>
+        </w:rPr>
+        <w:t>a. Halaman Login</w:t>
+      </w:r>
+    </w:p>
+    <w:p>
+      <w:pPr>
+        <w:ind w:left="715"/>
+        <w:rPr>
+          <w:b/>
+        </w:rPr>
+      </w:pPr>
+      <w:r>
+        <w:rPr>
+          <w:i/>
+          <w:noProof/>
+        </w:rPr>
+        <w:drawing>
+          <wp:inline distT="0" distB="0" distL="0" distR="0" wp14:anchorId="3BE5B4D4" wp14:editId="6F9B9580">
+            <wp:extent cx="2096773" cy="2241550"/>
+            <wp:effectExtent l="0" t="0" r="0" b="6350"/>
+            <wp:docPr id="1" name="Picture 1"/>
             <wp:cNvGraphicFramePr>
               <a:graphicFrameLocks xmlns:a="http://schemas.openxmlformats.org/drawingml/2006/main" noChangeAspect="1"/>
             </wp:cNvGraphicFramePr>
@@ -15274,7 +15844,7 @@
                   <pic:spPr>
                     <a:xfrm>
                       <a:off x="0" y="0"/>
-                      <a:ext cx="4559534" cy="2825895"/>
+                      <a:ext cx="2110228" cy="2255934"/>
                     </a:xfrm>
                     <a:prstGeom prst="rect">
                       <a:avLst/>
@@ -15289,50 +15859,29 @@
     </w:p>
     <w:p>
       <w:pPr>
-        <w:pStyle w:val="ListParagraph"/>
-        <w:numPr>
-          <w:ilvl w:val="0"/>
-          <w:numId w:val="17"/>
-        </w:numPr>
-      </w:pPr>
-      <w:r>
-        <w:t>Halaman Dashboard – menampilkan ringkasan informasi seperti jumlah dokumen, jumlah kasus aktif, dan aktivitas terbaru.</w:t>
-      </w:r>
-    </w:p>
-    <w:p>
-      <w:pPr>
-        <w:pStyle w:val="ListParagraph"/>
-        <w:ind w:left="1065" w:firstLine="0"/>
-        <w:rPr>
-          <w:lang w:val="en-US"/>
-        </w:rPr>
-      </w:pPr>
-      <w:r>
-        <w:rPr>
-          <w:lang w:val="en-US"/>
-        </w:rPr>
-        <w:t>Role admin</w:t>
-      </w:r>
-    </w:p>
-    <w:p>
-      <w:pPr>
-        <w:pStyle w:val="ListParagraph"/>
-        <w:ind w:left="1065" w:firstLine="0"/>
-        <w:rPr>
-          <w:lang w:val="en-US"/>
-        </w:rPr>
+        <w:ind w:left="715"/>
+      </w:pPr>
+      <w:r>
+        <w:rPr>
+          <w:b/>
+        </w:rPr>
+        <w:lastRenderedPageBreak/>
+        <w:t>b. Halaman Dashboard</w:t>
+      </w:r>
+    </w:p>
+    <w:p>
+      <w:pPr>
+        <w:ind w:left="715"/>
       </w:pPr>
       <w:r>
         <w:rPr>
           <w:noProof/>
-          <w:lang w:val="en-US"/>
-        </w:rPr>
-        <w:lastRenderedPageBreak/>
+        </w:rPr>
         <w:drawing>
-          <wp:inline distT="0" distB="0" distL="0" distR="0" wp14:anchorId="4573CBAE" wp14:editId="0D890241">
-            <wp:extent cx="5493385" cy="3279775"/>
+          <wp:inline distT="0" distB="0" distL="0" distR="0" wp14:anchorId="59D8175A" wp14:editId="0A0954C6">
+            <wp:extent cx="5493385" cy="2216785"/>
             <wp:effectExtent l="0" t="0" r="0" b="0"/>
-            <wp:docPr id="11" name="Picture 11"/>
+            <wp:docPr id="7" name="Picture 7"/>
             <wp:cNvGraphicFramePr>
               <a:graphicFrameLocks xmlns:a="http://schemas.openxmlformats.org/drawingml/2006/main" noChangeAspect="1"/>
             </wp:cNvGraphicFramePr>
@@ -15352,7 +15901,7 @@
                   <pic:spPr>
                     <a:xfrm>
                       <a:off x="0" y="0"/>
-                      <a:ext cx="5493385" cy="3279775"/>
+                      <a:ext cx="5493385" cy="2216785"/>
                     </a:xfrm>
                     <a:prstGeom prst="rect">
                       <a:avLst/>
@@ -15364,1509 +15913,102 @@
           </wp:inline>
         </w:drawing>
       </w:r>
-    </w:p>
-    <w:p>
-      <w:pPr>
-        <w:pStyle w:val="ListParagraph"/>
-        <w:ind w:left="1065" w:firstLine="0"/>
-        <w:rPr>
-          <w:lang w:val="en-US"/>
-        </w:rPr>
-      </w:pPr>
-      <w:r>
-        <w:rPr>
-          <w:lang w:val="en-US"/>
-        </w:rPr>
-        <w:t>Role lawyer</w:t>
-      </w:r>
-    </w:p>
-    <w:p>
-      <w:pPr>
-        <w:pStyle w:val="ListParagraph"/>
-        <w:ind w:left="1065" w:firstLine="0"/>
-        <w:rPr>
-          <w:lang w:val="en-US"/>
-        </w:rPr>
-      </w:pPr>
-      <w:r>
-        <w:rPr>
-          <w:noProof/>
-          <w:lang w:val="en-US"/>
-        </w:rPr>
-        <w:drawing>
-          <wp:inline distT="0" distB="0" distL="0" distR="0" wp14:anchorId="770063D4" wp14:editId="297D5660">
-            <wp:extent cx="5493385" cy="3401695"/>
-            <wp:effectExtent l="0" t="0" r="0" b="8255"/>
-            <wp:docPr id="12" name="Picture 12"/>
-            <wp:cNvGraphicFramePr>
-              <a:graphicFrameLocks xmlns:a="http://schemas.openxmlformats.org/drawingml/2006/main" noChangeAspect="1"/>
-            </wp:cNvGraphicFramePr>
-            <a:graphic xmlns:a="http://schemas.openxmlformats.org/drawingml/2006/main">
-              <a:graphicData uri="http://schemas.openxmlformats.org/drawingml/2006/picture">
-                <pic:pic xmlns:pic="http://schemas.openxmlformats.org/drawingml/2006/picture">
-                  <pic:nvPicPr>
-                    <pic:cNvPr id="1" name=""/>
-                    <pic:cNvPicPr/>
-                  </pic:nvPicPr>
-                  <pic:blipFill>
-                    <a:blip r:embed="rId46"/>
-                    <a:stretch>
-                      <a:fillRect/>
-                    </a:stretch>
-                  </pic:blipFill>
-                  <pic:spPr>
-                    <a:xfrm>
-                      <a:off x="0" y="0"/>
-                      <a:ext cx="5493385" cy="3401695"/>
-                    </a:xfrm>
-                    <a:prstGeom prst="rect">
-                      <a:avLst/>
-                    </a:prstGeom>
-                  </pic:spPr>
-                </pic:pic>
-              </a:graphicData>
-            </a:graphic>
-          </wp:inline>
-        </w:drawing>
-      </w:r>
-    </w:p>
-    <w:p>
-      <w:pPr>
-        <w:pStyle w:val="ListParagraph"/>
-        <w:ind w:left="1065" w:firstLine="0"/>
-        <w:rPr>
-          <w:lang w:val="en-US"/>
-        </w:rPr>
-      </w:pPr>
-      <w:r>
-        <w:rPr>
-          <w:lang w:val="en-US"/>
-        </w:rPr>
-        <w:t>Role staff</w:t>
-      </w:r>
-    </w:p>
-    <w:p>
-      <w:pPr>
-        <w:pStyle w:val="ListParagraph"/>
-        <w:ind w:left="1065" w:firstLine="0"/>
-        <w:rPr>
-          <w:lang w:val="en-US"/>
-        </w:rPr>
-      </w:pPr>
-      <w:r>
-        <w:rPr>
-          <w:noProof/>
-          <w:lang w:val="en-US"/>
-        </w:rPr>
-        <w:lastRenderedPageBreak/>
-        <w:drawing>
-          <wp:inline distT="0" distB="0" distL="0" distR="0" wp14:anchorId="774708F0" wp14:editId="21CB8F41">
-            <wp:extent cx="3973057" cy="2480003"/>
-            <wp:effectExtent l="0" t="0" r="0" b="0"/>
-            <wp:docPr id="13" name="Picture 13"/>
-            <wp:cNvGraphicFramePr>
-              <a:graphicFrameLocks xmlns:a="http://schemas.openxmlformats.org/drawingml/2006/main" noChangeAspect="1"/>
-            </wp:cNvGraphicFramePr>
-            <a:graphic xmlns:a="http://schemas.openxmlformats.org/drawingml/2006/main">
-              <a:graphicData uri="http://schemas.openxmlformats.org/drawingml/2006/picture">
-                <pic:pic xmlns:pic="http://schemas.openxmlformats.org/drawingml/2006/picture">
-                  <pic:nvPicPr>
-                    <pic:cNvPr id="1" name=""/>
-                    <pic:cNvPicPr/>
-                  </pic:nvPicPr>
-                  <pic:blipFill>
-                    <a:blip r:embed="rId47"/>
-                    <a:stretch>
-                      <a:fillRect/>
-                    </a:stretch>
-                  </pic:blipFill>
-                  <pic:spPr>
-                    <a:xfrm>
-                      <a:off x="0" y="0"/>
-                      <a:ext cx="3973057" cy="2480003"/>
-                    </a:xfrm>
-                    <a:prstGeom prst="rect">
-                      <a:avLst/>
-                    </a:prstGeom>
-                  </pic:spPr>
-                </pic:pic>
-              </a:graphicData>
-            </a:graphic>
-          </wp:inline>
-        </w:drawing>
-      </w:r>
-    </w:p>
-    <w:p>
-      <w:pPr>
-        <w:pStyle w:val="ListParagraph"/>
-        <w:ind w:left="1065" w:firstLine="0"/>
-      </w:pPr>
+      <w:r>
+        <w:softHyphen/>
+      </w:r>
+      <w:r>
+        <w:softHyphen/>
+      </w:r>
     </w:p>
     <w:p>
       <w:pPr>
         <w:ind w:left="715"/>
       </w:pPr>
       <w:r>
-        <w:t>c. Halaman Upload Dokumen – berisi form untuk mengunggah dokumen baru beserta kategori dan kasus terkait.</w:t>
+        <w:rPr>
+          <w:b/>
+        </w:rPr>
+        <w:t>c. Halaman Upload Dokumen</w:t>
       </w:r>
     </w:p>
     <w:p>
       <w:pPr>
         <w:ind w:left="715"/>
       </w:pPr>
+      <w:r>
+        <w:rPr>
+          <w:i/>
+        </w:rPr>
+        <w:t>[Sisipkan screenshot halaman upload dokumen di sini]</w:t>
+      </w:r>
     </w:p>
     <w:p>
       <w:pPr>
         <w:ind w:left="715"/>
       </w:pPr>
       <w:r>
-        <w:t>d. Halaman Pencarian/Daftar Dokumen – menampilkan daftar dokumen yang dapat dicari dan difilter berdasarkan kategori, kasus, atau tanggal unggah.</w:t>
+        <w:rPr>
+          <w:b/>
+        </w:rPr>
+        <w:t>d. Halaman Pencarian/Daftar Dokumen</w:t>
       </w:r>
     </w:p>
     <w:p>
       <w:pPr>
         <w:ind w:left="715"/>
       </w:pPr>
+      <w:r>
+        <w:rPr>
+          <w:i/>
+        </w:rPr>
+        <w:t>[Sisipkan screenshot halaman pencarian/daftar dokumen di sini]</w:t>
+      </w:r>
     </w:p>
     <w:p>
       <w:pPr>
         <w:ind w:left="715"/>
       </w:pPr>
       <w:r>
-        <w:t>e. Halaman Kelola Kategori dan Data Kasus – khusus diakses oleh Admin untuk menambah, mengubah, atau menghapus data kategori dan kasus.</w:t>
+        <w:rPr>
+          <w:b/>
+        </w:rPr>
+        <w:t>e. Halaman Kelola Kategori dan Data Kasus</w:t>
       </w:r>
     </w:p>
     <w:p>
       <w:pPr>
         <w:ind w:left="715"/>
       </w:pPr>
-    </w:p>
-    <w:p>
-      <w:pPr>
-        <w:spacing w:after="72" w:line="259" w:lineRule="auto"/>
-        <w:ind w:left="214" w:firstLine="0"/>
-        <w:jc w:val="left"/>
-      </w:pPr>
-    </w:p>
-    <w:p>
-      <w:pPr>
-        <w:pStyle w:val="Heading1"/>
-        <w:rPr>
-          <w:lang w:val="en-US"/>
-        </w:rPr>
-      </w:pPr>
-      <w:bookmarkStart w:id="42" w:name="_Toc235282798"/>
-      <w:r>
-        <w:rPr>
-          <w:lang w:val="en-US"/>
-        </w:rPr>
-        <w:t>BAB IV</w:t>
-      </w:r>
-      <w:bookmarkEnd w:id="42"/>
-      <w:r>
-        <w:rPr>
-          <w:lang w:val="en-US"/>
-        </w:rPr>
-        <w:t xml:space="preserve"> </w:t>
-      </w:r>
-    </w:p>
-    <w:p>
-      <w:pPr>
+      <w:r>
+        <w:rPr>
+          <w:i/>
+        </w:rPr>
+        <w:t>[Sisipkan screenshot halaman kelola kategori/kasus di sini]</w:t>
+      </w:r>
+    </w:p>
+    <w:p>
+      <w:pPr>
+        <w:ind w:left="715"/>
+      </w:pPr>
+      <w:r>
         <w:rPr>
           <w:b/>
-          <w:lang w:val="en-US"/>
-        </w:rPr>
-      </w:pPr>
-      <w:r>
-        <w:rPr>
-          <w:b/>
-          <w:lang w:val="en-US"/>
-        </w:rPr>
-        <w:tab/>
-      </w:r>
-      <w:r>
-        <w:rPr>
-          <w:b/>
-          <w:lang w:val="en-US"/>
-        </w:rPr>
-        <w:tab/>
-      </w:r>
-      <w:r>
-        <w:rPr>
-          <w:b/>
-          <w:lang w:val="en-US"/>
-        </w:rPr>
-        <w:tab/>
-      </w:r>
-      <w:r>
-        <w:rPr>
-          <w:b/>
-          <w:lang w:val="en-US"/>
-        </w:rPr>
-        <w:tab/>
-        <w:t xml:space="preserve">     IMPLEMENTASI DAN PENGUJIAN</w:t>
-      </w:r>
-    </w:p>
-    <w:p>
-      <w:pPr>
-        <w:pStyle w:val="Heading2"/>
-        <w:rPr>
-          <w:lang w:val="en-US"/>
-        </w:rPr>
-      </w:pPr>
-      <w:bookmarkStart w:id="43" w:name="_Toc235282799"/>
-      <w:r>
-        <w:rPr>
-          <w:lang w:val="en-US"/>
-        </w:rPr>
-        <w:t>4.1 Implementasi</w:t>
-      </w:r>
-      <w:bookmarkEnd w:id="43"/>
-    </w:p>
-    <w:p>
-      <w:pPr>
-        <w:rPr>
-          <w:lang w:val="en-US"/>
-        </w:rPr>
-      </w:pPr>
-      <w:r>
-        <w:t>Tahap implementasi merupakan tahap dari kelanjutan perancangan sistem yang sudah dibuat sebelumnya. Hasil dari tahap ini yaitu sebuah sistem yang nantinya siap untuk digunakan dan diuji.</w:t>
-      </w:r>
-    </w:p>
-    <w:p>
-      <w:pPr>
-        <w:pStyle w:val="Heading3"/>
-        <w:rPr>
-          <w:i w:val="0"/>
-          <w:iCs/>
-          <w:lang w:val="en-US"/>
-        </w:rPr>
-      </w:pPr>
-      <w:r>
-        <w:rPr>
-          <w:lang w:val="en-US"/>
-        </w:rPr>
-        <w:tab/>
-      </w:r>
-      <w:r>
-        <w:rPr>
-          <w:lang w:val="en-US"/>
-        </w:rPr>
-        <w:tab/>
-      </w:r>
-      <w:bookmarkStart w:id="44" w:name="_Toc235282800"/>
-      <w:r>
-        <w:rPr>
-          <w:i w:val="0"/>
-          <w:iCs/>
-          <w:lang w:val="en-US"/>
-        </w:rPr>
-        <w:t>4.1.1 Implementasi Perangkat Keras</w:t>
-      </w:r>
-      <w:bookmarkEnd w:id="44"/>
-    </w:p>
-    <w:p>
-      <w:r>
-        <w:t xml:space="preserve">Perangkat keras yang digunakan dalam pembuatan aplikasi sistem informasi pada </w:t>
-      </w:r>
-      <w:r>
-        <w:rPr>
-          <w:lang w:val="en-US"/>
-        </w:rPr>
-        <w:t>ODS Law Firm</w:t>
-      </w:r>
-      <w:r>
-        <w:t xml:space="preserve"> adalah komputer personal dengan spesifikasi berikut:</w:t>
-      </w:r>
-    </w:p>
-    <w:p>
-      <w:pPr>
-        <w:jc w:val="center"/>
-      </w:pPr>
-      <w:r>
-        <w:t>Tabel 4.1</w:t>
-      </w:r>
-      <w:r>
-        <w:rPr>
-          <w:lang w:val="en-US"/>
-        </w:rPr>
-        <w:t>.1</w:t>
-      </w:r>
-      <w:r>
-        <w:t xml:space="preserve"> Spesifikasi Implementasi Perangkat Keras (Hardware)</w:t>
-      </w:r>
-    </w:p>
-    <w:tbl>
-      <w:tblPr>
-        <w:tblStyle w:val="TableGrid0"/>
-        <w:tblW w:w="0" w:type="auto"/>
-        <w:tblInd w:w="425" w:type="dxa"/>
-        <w:tblLook w:val="04A0" w:firstRow="1" w:lastRow="0" w:firstColumn="1" w:lastColumn="0" w:noHBand="0" w:noVBand="1"/>
-      </w:tblPr>
-      <w:tblGrid>
-        <w:gridCol w:w="510"/>
-        <w:gridCol w:w="4956"/>
-        <w:gridCol w:w="2750"/>
-      </w:tblGrid>
-      <w:tr>
-        <w:tc>
-          <w:tcPr>
-            <w:tcW w:w="470" w:type="dxa"/>
-          </w:tcPr>
-          <w:p>
-            <w:pPr>
-              <w:ind w:left="0" w:firstLine="0"/>
-              <w:rPr>
-                <w:lang w:val="en-US"/>
-              </w:rPr>
-            </w:pPr>
-            <w:r>
-              <w:rPr>
-                <w:lang w:val="en-US"/>
-              </w:rPr>
-              <w:t>No</w:t>
-            </w:r>
-          </w:p>
-        </w:tc>
-        <w:tc>
-          <w:tcPr>
-            <w:tcW w:w="4985" w:type="dxa"/>
-          </w:tcPr>
-          <w:p>
-            <w:pPr>
-              <w:ind w:left="0" w:firstLine="0"/>
-              <w:rPr>
-                <w:lang w:val="en-US"/>
-              </w:rPr>
-            </w:pPr>
-            <w:r>
-              <w:rPr>
-                <w:lang w:val="en-US"/>
-              </w:rPr>
-              <w:t>Perangkat Keras</w:t>
-            </w:r>
-          </w:p>
-        </w:tc>
-        <w:tc>
-          <w:tcPr>
-            <w:tcW w:w="2761" w:type="dxa"/>
-          </w:tcPr>
-          <w:p>
-            <w:pPr>
-              <w:ind w:left="0" w:firstLine="0"/>
-              <w:rPr>
-                <w:lang w:val="en-US"/>
-              </w:rPr>
-            </w:pPr>
-            <w:r>
-              <w:rPr>
-                <w:lang w:val="en-US"/>
-              </w:rPr>
-              <w:t>Spesifikasi</w:t>
-            </w:r>
-          </w:p>
-        </w:tc>
-      </w:tr>
-      <w:tr>
-        <w:tc>
-          <w:tcPr>
-            <w:tcW w:w="470" w:type="dxa"/>
-          </w:tcPr>
-          <w:p>
-            <w:pPr>
-              <w:ind w:left="0" w:firstLine="0"/>
-              <w:rPr>
-                <w:lang w:val="en-US"/>
-              </w:rPr>
-            </w:pPr>
-            <w:r>
-              <w:rPr>
-                <w:lang w:val="en-US"/>
-              </w:rPr>
-              <w:t>1</w:t>
-            </w:r>
-          </w:p>
-        </w:tc>
-        <w:tc>
-          <w:tcPr>
-            <w:tcW w:w="4985" w:type="dxa"/>
-          </w:tcPr>
-          <w:p>
-            <w:pPr>
-              <w:ind w:left="0" w:firstLine="0"/>
-              <w:rPr>
-                <w:lang w:val="en-US"/>
-              </w:rPr>
-            </w:pPr>
-            <w:r>
-              <w:t>Processor</w:t>
-            </w:r>
-          </w:p>
-        </w:tc>
-        <w:tc>
-          <w:tcPr>
-            <w:tcW w:w="2761" w:type="dxa"/>
-          </w:tcPr>
-          <w:p>
-            <w:pPr>
-              <w:ind w:left="0" w:firstLine="0"/>
-              <w:rPr>
-                <w:lang w:val="en-US"/>
-              </w:rPr>
-            </w:pPr>
-            <w:r>
-              <w:rPr>
-                <w:lang w:val="en-US"/>
-              </w:rPr>
-              <w:t>Intel core i7</w:t>
-            </w:r>
-          </w:p>
-        </w:tc>
-      </w:tr>
-      <w:tr>
-        <w:tc>
-          <w:tcPr>
-            <w:tcW w:w="470" w:type="dxa"/>
-          </w:tcPr>
-          <w:p>
-            <w:pPr>
-              <w:ind w:left="0" w:firstLine="0"/>
-              <w:rPr>
-                <w:lang w:val="en-US"/>
-              </w:rPr>
-            </w:pPr>
-            <w:r>
-              <w:rPr>
-                <w:lang w:val="en-US"/>
-              </w:rPr>
-              <w:t>2</w:t>
-            </w:r>
-          </w:p>
-        </w:tc>
-        <w:tc>
-          <w:tcPr>
-            <w:tcW w:w="4985" w:type="dxa"/>
-          </w:tcPr>
-          <w:p>
-            <w:pPr>
-              <w:ind w:left="0" w:firstLine="0"/>
-              <w:rPr>
-                <w:lang w:val="en-US"/>
-              </w:rPr>
-            </w:pPr>
-            <w:r>
-              <w:t>Memory RAM</w:t>
-            </w:r>
-          </w:p>
-        </w:tc>
-        <w:tc>
-          <w:tcPr>
-            <w:tcW w:w="2761" w:type="dxa"/>
-          </w:tcPr>
-          <w:p>
-            <w:pPr>
-              <w:ind w:left="0" w:firstLine="0"/>
-              <w:rPr>
-                <w:lang w:val="en-US"/>
-              </w:rPr>
-            </w:pPr>
-            <w:r>
-              <w:rPr>
-                <w:lang w:val="en-US"/>
-              </w:rPr>
-              <w:t>8 GB</w:t>
-            </w:r>
-          </w:p>
-        </w:tc>
-      </w:tr>
-      <w:tr>
-        <w:tc>
-          <w:tcPr>
-            <w:tcW w:w="470" w:type="dxa"/>
-          </w:tcPr>
-          <w:p>
-            <w:pPr>
-              <w:ind w:left="0" w:firstLine="0"/>
-              <w:rPr>
-                <w:lang w:val="en-US"/>
-              </w:rPr>
-            </w:pPr>
-            <w:r>
-              <w:rPr>
-                <w:lang w:val="en-US"/>
-              </w:rPr>
-              <w:t>3</w:t>
-            </w:r>
-          </w:p>
-        </w:tc>
-        <w:tc>
-          <w:tcPr>
-            <w:tcW w:w="4985" w:type="dxa"/>
-          </w:tcPr>
-          <w:p>
-            <w:pPr>
-              <w:ind w:left="0" w:firstLine="0"/>
-              <w:rPr>
-                <w:lang w:val="en-US"/>
-              </w:rPr>
-            </w:pPr>
-            <w:r>
-              <w:t>SSD</w:t>
-            </w:r>
-          </w:p>
-        </w:tc>
-        <w:tc>
-          <w:tcPr>
-            <w:tcW w:w="2761" w:type="dxa"/>
-          </w:tcPr>
-          <w:p>
-            <w:pPr>
-              <w:ind w:left="0" w:firstLine="0"/>
-              <w:rPr>
-                <w:lang w:val="en-US"/>
-              </w:rPr>
-            </w:pPr>
-            <w:r>
-              <w:rPr>
-                <w:lang w:val="en-US"/>
-              </w:rPr>
-              <w:t>256 GB</w:t>
-            </w:r>
-          </w:p>
-        </w:tc>
-      </w:tr>
-    </w:tbl>
-    <w:p>
-      <w:pPr>
-        <w:rPr>
-          <w:lang w:val="en-US"/>
-        </w:rPr>
-      </w:pPr>
-    </w:p>
-    <w:p>
-      <w:pPr>
-        <w:rPr>
-          <w:lang w:val="en-US"/>
-        </w:rPr>
-      </w:pPr>
-    </w:p>
-    <w:p>
-      <w:pPr>
-        <w:pStyle w:val="Heading3"/>
-        <w:rPr>
-          <w:i w:val="0"/>
-          <w:iCs/>
-          <w:lang w:val="en-US"/>
-        </w:rPr>
-      </w:pPr>
-      <w:r>
-        <w:rPr>
-          <w:i w:val="0"/>
-          <w:iCs/>
-          <w:lang w:val="en-US"/>
-        </w:rPr>
-        <w:tab/>
-      </w:r>
-      <w:r>
-        <w:rPr>
-          <w:i w:val="0"/>
-          <w:iCs/>
-          <w:lang w:val="en-US"/>
-        </w:rPr>
-        <w:tab/>
-      </w:r>
-      <w:bookmarkStart w:id="45" w:name="_Toc235282801"/>
-      <w:r>
-        <w:rPr>
-          <w:i w:val="0"/>
-          <w:iCs/>
-          <w:lang w:val="en-US"/>
-        </w:rPr>
-        <w:t>4.1.2 Implementasi Perangkat Lunak</w:t>
-      </w:r>
-      <w:bookmarkEnd w:id="45"/>
-    </w:p>
-    <w:p>
-      <w:r>
-        <w:t>Perangkat lunak yang digunakan untuk mengimplementasikan sistem adalah sebagai berikut :</w:t>
-      </w:r>
-    </w:p>
-    <w:p>
-      <w:pPr>
-        <w:jc w:val="center"/>
-      </w:pPr>
-      <w:r>
-        <w:t>Tabel 4.</w:t>
-      </w:r>
-      <w:r>
-        <w:rPr>
-          <w:lang w:val="en-US"/>
-        </w:rPr>
-        <w:t>1.</w:t>
-      </w:r>
-      <w:r>
-        <w:t>2 Implementasi Perangkat Lunak (Software)</w:t>
-      </w:r>
-    </w:p>
-    <w:tbl>
-      <w:tblPr>
-        <w:tblStyle w:val="TableGrid0"/>
-        <w:tblW w:w="0" w:type="auto"/>
-        <w:tblInd w:w="425" w:type="dxa"/>
-        <w:tblLook w:val="04A0" w:firstRow="1" w:lastRow="0" w:firstColumn="1" w:lastColumn="0" w:noHBand="0" w:noVBand="1"/>
-      </w:tblPr>
-      <w:tblGrid>
-        <w:gridCol w:w="560"/>
-        <w:gridCol w:w="4917"/>
-        <w:gridCol w:w="2739"/>
-      </w:tblGrid>
-      <w:tr>
-        <w:tc>
-          <w:tcPr>
-            <w:tcW w:w="560" w:type="dxa"/>
-          </w:tcPr>
-          <w:p>
-            <w:pPr>
-              <w:ind w:left="0" w:firstLine="0"/>
-              <w:jc w:val="left"/>
-              <w:rPr>
-                <w:lang w:val="en-US"/>
-              </w:rPr>
-            </w:pPr>
-            <w:r>
-              <w:rPr>
-                <w:lang w:val="en-US"/>
-              </w:rPr>
-              <w:t>No</w:t>
-            </w:r>
-          </w:p>
-        </w:tc>
-        <w:tc>
-          <w:tcPr>
-            <w:tcW w:w="4917" w:type="dxa"/>
-          </w:tcPr>
-          <w:p>
-            <w:pPr>
-              <w:ind w:left="0" w:firstLine="0"/>
-              <w:jc w:val="left"/>
-              <w:rPr>
-                <w:lang w:val="en-US"/>
-              </w:rPr>
-            </w:pPr>
-            <w:r>
-              <w:rPr>
-                <w:lang w:val="en-US"/>
-              </w:rPr>
-              <w:t>Perangkat Lunak</w:t>
-            </w:r>
-          </w:p>
-        </w:tc>
-        <w:tc>
-          <w:tcPr>
-            <w:tcW w:w="2739" w:type="dxa"/>
-          </w:tcPr>
-          <w:p>
-            <w:pPr>
-              <w:ind w:left="0" w:firstLine="0"/>
-              <w:jc w:val="left"/>
-              <w:rPr>
-                <w:lang w:val="en-US"/>
-              </w:rPr>
-            </w:pPr>
-            <w:r>
-              <w:t>Keterangan</w:t>
-            </w:r>
-          </w:p>
-        </w:tc>
-      </w:tr>
-      <w:tr>
-        <w:tc>
-          <w:tcPr>
-            <w:tcW w:w="560" w:type="dxa"/>
-          </w:tcPr>
-          <w:p>
-            <w:pPr>
-              <w:ind w:left="0" w:firstLine="0"/>
-              <w:jc w:val="left"/>
-              <w:rPr>
-                <w:lang w:val="en-US"/>
-              </w:rPr>
-            </w:pPr>
-            <w:r>
-              <w:rPr>
-                <w:lang w:val="en-US"/>
-              </w:rPr>
-              <w:lastRenderedPageBreak/>
-              <w:t>1</w:t>
-            </w:r>
-          </w:p>
-        </w:tc>
-        <w:tc>
-          <w:tcPr>
-            <w:tcW w:w="4917" w:type="dxa"/>
-          </w:tcPr>
-          <w:p>
-            <w:pPr>
-              <w:ind w:left="0" w:firstLine="0"/>
-              <w:jc w:val="left"/>
-              <w:rPr>
-                <w:lang w:val="en-US"/>
-              </w:rPr>
-            </w:pPr>
-            <w:r>
-              <w:rPr>
-                <w:lang w:val="en-US"/>
-              </w:rPr>
-              <w:t xml:space="preserve">Sistem Operasi </w:t>
-            </w:r>
-          </w:p>
-        </w:tc>
-        <w:tc>
-          <w:tcPr>
-            <w:tcW w:w="2739" w:type="dxa"/>
-          </w:tcPr>
-          <w:p>
-            <w:pPr>
-              <w:ind w:left="0" w:firstLine="0"/>
-              <w:jc w:val="left"/>
-              <w:rPr>
-                <w:lang w:val="en-US"/>
-              </w:rPr>
-            </w:pPr>
-            <w:r>
-              <w:rPr>
-                <w:lang w:val="en-US"/>
-              </w:rPr>
-              <w:t>Win</w:t>
-            </w:r>
-            <w:r>
-              <w:rPr>
-                <w:lang w:val="en-US"/>
-              </w:rPr>
-              <w:t xml:space="preserve"> 10 64 bit</w:t>
-            </w:r>
-          </w:p>
-        </w:tc>
-      </w:tr>
-      <w:tr>
-        <w:tc>
-          <w:tcPr>
-            <w:tcW w:w="560" w:type="dxa"/>
-          </w:tcPr>
-          <w:p>
-            <w:pPr>
-              <w:ind w:left="0" w:firstLine="0"/>
-              <w:jc w:val="left"/>
-              <w:rPr>
-                <w:lang w:val="en-US"/>
-              </w:rPr>
-            </w:pPr>
-            <w:r>
-              <w:rPr>
-                <w:lang w:val="en-US"/>
-              </w:rPr>
-              <w:t>2</w:t>
-            </w:r>
-          </w:p>
-        </w:tc>
-        <w:tc>
-          <w:tcPr>
-            <w:tcW w:w="4917" w:type="dxa"/>
-          </w:tcPr>
-          <w:p>
-            <w:pPr>
-              <w:ind w:left="0" w:firstLine="0"/>
-              <w:jc w:val="left"/>
-              <w:rPr>
-                <w:lang w:val="en-US"/>
-              </w:rPr>
-            </w:pPr>
-            <w:r>
-              <w:rPr>
-                <w:lang w:val="en-US"/>
-              </w:rPr>
-              <w:t>Database</w:t>
-            </w:r>
-          </w:p>
-        </w:tc>
-        <w:tc>
-          <w:tcPr>
-            <w:tcW w:w="2739" w:type="dxa"/>
-          </w:tcPr>
-          <w:p>
-            <w:pPr>
-              <w:ind w:left="0" w:firstLine="0"/>
-              <w:jc w:val="left"/>
-              <w:rPr>
-                <w:lang w:val="en-US"/>
-              </w:rPr>
-            </w:pPr>
-            <w:r>
-              <w:t>MySQL Versi 10.4.14</w:t>
-            </w:r>
-          </w:p>
-        </w:tc>
-      </w:tr>
-      <w:tr>
-        <w:tc>
-          <w:tcPr>
-            <w:tcW w:w="560" w:type="dxa"/>
-          </w:tcPr>
-          <w:p>
-            <w:pPr>
-              <w:ind w:left="0" w:firstLine="0"/>
-              <w:jc w:val="left"/>
-              <w:rPr>
-                <w:lang w:val="en-US"/>
-              </w:rPr>
-            </w:pPr>
-            <w:r>
-              <w:rPr>
-                <w:lang w:val="en-US"/>
-              </w:rPr>
-              <w:t>3</w:t>
-            </w:r>
-          </w:p>
-        </w:tc>
-        <w:tc>
-          <w:tcPr>
-            <w:tcW w:w="4917" w:type="dxa"/>
-          </w:tcPr>
-          <w:p>
-            <w:pPr>
-              <w:ind w:left="0" w:firstLine="0"/>
-              <w:jc w:val="left"/>
-              <w:rPr>
-                <w:lang w:val="en-US"/>
-              </w:rPr>
-            </w:pPr>
-            <w:r>
-              <w:rPr>
-                <w:lang w:val="en-US"/>
-              </w:rPr>
-              <w:t xml:space="preserve">Text Editor </w:t>
-            </w:r>
-          </w:p>
-        </w:tc>
-        <w:tc>
-          <w:tcPr>
-            <w:tcW w:w="2739" w:type="dxa"/>
-          </w:tcPr>
-          <w:p>
-            <w:pPr>
-              <w:ind w:left="0" w:firstLine="0"/>
-              <w:jc w:val="left"/>
-              <w:rPr>
-                <w:lang w:val="en-US"/>
-              </w:rPr>
-            </w:pPr>
-            <w:r>
-              <w:rPr>
-                <w:lang w:val="en-US"/>
-              </w:rPr>
-              <w:t>Vs Code</w:t>
-            </w:r>
-          </w:p>
-        </w:tc>
-      </w:tr>
-      <w:tr>
-        <w:tc>
-          <w:tcPr>
-            <w:tcW w:w="560" w:type="dxa"/>
-          </w:tcPr>
-          <w:p>
-            <w:pPr>
-              <w:ind w:left="0" w:firstLine="0"/>
-              <w:jc w:val="left"/>
-              <w:rPr>
-                <w:lang w:val="en-US"/>
-              </w:rPr>
-            </w:pPr>
-            <w:r>
-              <w:rPr>
-                <w:lang w:val="en-US"/>
-              </w:rPr>
-              <w:t>4</w:t>
-            </w:r>
-          </w:p>
-        </w:tc>
-        <w:tc>
-          <w:tcPr>
-            <w:tcW w:w="4917" w:type="dxa"/>
-          </w:tcPr>
-          <w:p>
-            <w:pPr>
-              <w:ind w:left="0" w:firstLine="0"/>
-              <w:jc w:val="left"/>
-              <w:rPr>
-                <w:lang w:val="en-US"/>
-              </w:rPr>
-            </w:pPr>
-            <w:r>
-              <w:rPr>
-                <w:lang w:val="en-US"/>
-              </w:rPr>
-              <w:t>Programming</w:t>
-            </w:r>
-          </w:p>
-        </w:tc>
-        <w:tc>
-          <w:tcPr>
-            <w:tcW w:w="2739" w:type="dxa"/>
-          </w:tcPr>
-          <w:p>
-            <w:pPr>
-              <w:ind w:left="0" w:firstLine="0"/>
-              <w:jc w:val="left"/>
-              <w:rPr>
-                <w:lang w:val="en-US"/>
-              </w:rPr>
-            </w:pPr>
-            <w:r>
-              <w:rPr>
-                <w:lang w:val="en-US"/>
-              </w:rPr>
-              <w:t>PHP</w:t>
-            </w:r>
-          </w:p>
-        </w:tc>
-      </w:tr>
-    </w:tbl>
-    <w:p>
-      <w:pPr>
-        <w:jc w:val="left"/>
-        <w:rPr>
-          <w:lang w:val="en-US"/>
-        </w:rPr>
-      </w:pPr>
-    </w:p>
-    <w:p>
-      <w:pPr>
-        <w:pStyle w:val="Heading3"/>
-        <w:rPr>
-          <w:i w:val="0"/>
-          <w:iCs/>
-        </w:rPr>
-      </w:pPr>
-      <w:bookmarkStart w:id="46" w:name="_Toc235284001"/>
-      <w:r>
-        <w:rPr>
-          <w:i w:val="0"/>
-          <w:iCs/>
-        </w:rPr>
-        <w:t>4.1.3 Implementasi Antarmuka</w:t>
-      </w:r>
-      <w:bookmarkEnd w:id="46"/>
+        </w:rPr>
+        <w:t>f. Halaman Laporan</w:t>
+      </w:r>
     </w:p>
     <w:p>
       <w:pPr>
         <w:ind w:left="715"/>
       </w:pPr>
       <w:r>
-        <w:t>Bagian ini menampilkan hasil implementasi antarmuka (interface) Sistem Informasi Pemberkasan pada Law Firm ODS yang telah dibangun sesuai dengan rancangan pada Bab III.</w:t>
-      </w:r>
-    </w:p>
-    <w:p>
-      <w:pPr>
-        <w:ind w:left="715"/>
-      </w:pPr>
-      <w:r>
-        <w:rPr>
-          <w:b/>
-        </w:rPr>
-        <w:t>a. Halaman Login</w:t>
-      </w:r>
-    </w:p>
-    <w:p>
-      <w:pPr>
-        <w:ind w:left="715"/>
-        <w:rPr>
-          <w:b/>
-        </w:rPr>
-      </w:pPr>
-      <w:r>
-        <w:rPr>
-          <w:b/>
-        </w:rPr>
-        <w:drawing>
-          <wp:inline distT="0" distB="0" distL="0" distR="0" wp14:anchorId="70A76453" wp14:editId="60C0AB7A">
-            <wp:extent cx="3962604" cy="3314870"/>
-            <wp:effectExtent l="0" t="0" r="0" b="0"/>
-            <wp:docPr id="2" name="Picture 2"/>
-            <wp:cNvGraphicFramePr>
-              <a:graphicFrameLocks xmlns:a="http://schemas.openxmlformats.org/drawingml/2006/main" noChangeAspect="1"/>
-            </wp:cNvGraphicFramePr>
-            <a:graphic xmlns:a="http://schemas.openxmlformats.org/drawingml/2006/main">
-              <a:graphicData uri="http://schemas.openxmlformats.org/drawingml/2006/picture">
-                <pic:pic xmlns:pic="http://schemas.openxmlformats.org/drawingml/2006/picture">
-                  <pic:nvPicPr>
-                    <pic:cNvPr id="1" name=""/>
-                    <pic:cNvPicPr/>
-                  </pic:nvPicPr>
-                  <pic:blipFill>
-                    <a:blip r:embed="rId48"/>
-                    <a:stretch>
-                      <a:fillRect/>
-                    </a:stretch>
-                  </pic:blipFill>
-                  <pic:spPr>
-                    <a:xfrm>
-                      <a:off x="0" y="0"/>
-                      <a:ext cx="3962604" cy="3314870"/>
-                    </a:xfrm>
-                    <a:prstGeom prst="rect">
-                      <a:avLst/>
-                    </a:prstGeom>
-                  </pic:spPr>
-                </pic:pic>
-              </a:graphicData>
-            </a:graphic>
-          </wp:inline>
-        </w:drawing>
-      </w:r>
-    </w:p>
-    <w:p>
-      <w:pPr>
-        <w:ind w:left="715"/>
-      </w:pPr>
-      <w:r>
-        <w:rPr>
-          <w:b/>
-        </w:rPr>
-        <w:t>b. Halaman Dashboard</w:t>
-      </w:r>
-    </w:p>
-    <w:p>
-      <w:pPr>
-        <w:pStyle w:val="ListParagraph"/>
-        <w:ind w:left="1065" w:firstLine="0"/>
-        <w:rPr>
-          <w:lang w:val="en-US"/>
-        </w:rPr>
-      </w:pPr>
-      <w:r>
-        <w:rPr>
-          <w:lang w:val="en-US"/>
-        </w:rPr>
-        <w:t>Role admin</w:t>
-      </w:r>
-    </w:p>
-    <w:p>
-      <w:pPr>
-        <w:pStyle w:val="ListParagraph"/>
-        <w:ind w:left="1065" w:firstLine="0"/>
-        <w:rPr>
-          <w:lang w:val="en-US"/>
-        </w:rPr>
-      </w:pPr>
-      <w:r>
-        <w:rPr>
-          <w:lang w:val="en-US"/>
-        </w:rPr>
-        <w:drawing>
-          <wp:inline distT="0" distB="0" distL="0" distR="0" wp14:anchorId="42117974" wp14:editId="5A324955">
-            <wp:extent cx="5493385" cy="3255645"/>
-            <wp:effectExtent l="0" t="0" r="0" b="1905"/>
-            <wp:docPr id="3" name="Picture 3"/>
-            <wp:cNvGraphicFramePr>
-              <a:graphicFrameLocks xmlns:a="http://schemas.openxmlformats.org/drawingml/2006/main" noChangeAspect="1"/>
-            </wp:cNvGraphicFramePr>
-            <a:graphic xmlns:a="http://schemas.openxmlformats.org/drawingml/2006/main">
-              <a:graphicData uri="http://schemas.openxmlformats.org/drawingml/2006/picture">
-                <pic:pic xmlns:pic="http://schemas.openxmlformats.org/drawingml/2006/picture">
-                  <pic:nvPicPr>
-                    <pic:cNvPr id="1" name=""/>
-                    <pic:cNvPicPr/>
-                  </pic:nvPicPr>
-                  <pic:blipFill>
-                    <a:blip r:embed="rId49"/>
-                    <a:stretch>
-                      <a:fillRect/>
-                    </a:stretch>
-                  </pic:blipFill>
-                  <pic:spPr>
-                    <a:xfrm>
-                      <a:off x="0" y="0"/>
-                      <a:ext cx="5493385" cy="3255645"/>
-                    </a:xfrm>
-                    <a:prstGeom prst="rect">
-                      <a:avLst/>
-                    </a:prstGeom>
-                  </pic:spPr>
-                </pic:pic>
-              </a:graphicData>
-            </a:graphic>
-          </wp:inline>
-        </w:drawing>
-      </w:r>
-    </w:p>
-    <w:p>
-      <w:pPr>
-        <w:pStyle w:val="ListParagraph"/>
-        <w:ind w:left="1065" w:firstLine="0"/>
-        <w:rPr>
-          <w:lang w:val="en-US"/>
-        </w:rPr>
-      </w:pPr>
-      <w:r>
-        <w:rPr>
-          <w:lang w:val="en-US"/>
-        </w:rPr>
-        <w:lastRenderedPageBreak/>
-        <w:t>Role lawyer</w:t>
-      </w:r>
-    </w:p>
-    <w:p>
-      <w:pPr>
-        <w:pStyle w:val="ListParagraph"/>
-        <w:ind w:left="1065" w:firstLine="0"/>
-        <w:rPr>
-          <w:lang w:val="en-US"/>
-        </w:rPr>
-      </w:pPr>
-      <w:r>
-        <w:rPr>
-          <w:lang w:val="en-US"/>
-        </w:rPr>
-        <w:drawing>
-          <wp:inline distT="0" distB="0" distL="0" distR="0" wp14:anchorId="23748F50" wp14:editId="733B8640">
-            <wp:extent cx="5493385" cy="3310255"/>
-            <wp:effectExtent l="0" t="0" r="0" b="4445"/>
-            <wp:docPr id="5" name="Picture 5"/>
-            <wp:cNvGraphicFramePr>
-              <a:graphicFrameLocks xmlns:a="http://schemas.openxmlformats.org/drawingml/2006/main" noChangeAspect="1"/>
-            </wp:cNvGraphicFramePr>
-            <a:graphic xmlns:a="http://schemas.openxmlformats.org/drawingml/2006/main">
-              <a:graphicData uri="http://schemas.openxmlformats.org/drawingml/2006/picture">
-                <pic:pic xmlns:pic="http://schemas.openxmlformats.org/drawingml/2006/picture">
-                  <pic:nvPicPr>
-                    <pic:cNvPr id="1" name=""/>
-                    <pic:cNvPicPr/>
-                  </pic:nvPicPr>
-                  <pic:blipFill>
-                    <a:blip r:embed="rId50"/>
-                    <a:stretch>
-                      <a:fillRect/>
-                    </a:stretch>
-                  </pic:blipFill>
-                  <pic:spPr>
-                    <a:xfrm>
-                      <a:off x="0" y="0"/>
-                      <a:ext cx="5493385" cy="3310255"/>
-                    </a:xfrm>
-                    <a:prstGeom prst="rect">
-                      <a:avLst/>
-                    </a:prstGeom>
-                  </pic:spPr>
-                </pic:pic>
-              </a:graphicData>
-            </a:graphic>
-          </wp:inline>
-        </w:drawing>
-      </w:r>
-    </w:p>
-    <w:p>
-      <w:pPr>
-        <w:pStyle w:val="ListParagraph"/>
-        <w:ind w:left="1065" w:firstLine="0"/>
-        <w:rPr>
-          <w:lang w:val="en-US"/>
-        </w:rPr>
-      </w:pPr>
-      <w:r>
-        <w:rPr>
-          <w:lang w:val="en-US"/>
-        </w:rPr>
-        <w:t>Role staff</w:t>
-      </w:r>
-    </w:p>
-    <w:p>
-      <w:pPr>
-        <w:pStyle w:val="ListParagraph"/>
-        <w:ind w:left="1065" w:firstLine="0"/>
-        <w:rPr>
-          <w:lang w:val="en-US"/>
-        </w:rPr>
-      </w:pPr>
-      <w:r>
-        <w:rPr>
-          <w:lang w:val="en-US"/>
-        </w:rPr>
-        <w:drawing>
-          <wp:inline distT="0" distB="0" distL="0" distR="0" wp14:anchorId="1C86C1FC" wp14:editId="4DCF065A">
-            <wp:extent cx="5493385" cy="3409950"/>
-            <wp:effectExtent l="0" t="0" r="0" b="0"/>
-            <wp:docPr id="6" name="Picture 6"/>
-            <wp:cNvGraphicFramePr>
-              <a:graphicFrameLocks xmlns:a="http://schemas.openxmlformats.org/drawingml/2006/main" noChangeAspect="1"/>
-            </wp:cNvGraphicFramePr>
-            <a:graphic xmlns:a="http://schemas.openxmlformats.org/drawingml/2006/main">
-              <a:graphicData uri="http://schemas.openxmlformats.org/drawingml/2006/picture">
-                <pic:pic xmlns:pic="http://schemas.openxmlformats.org/drawingml/2006/picture">
-                  <pic:nvPicPr>
-                    <pic:cNvPr id="1" name=""/>
-                    <pic:cNvPicPr/>
-                  </pic:nvPicPr>
-                  <pic:blipFill>
-                    <a:blip r:embed="rId51"/>
-                    <a:stretch>
-                      <a:fillRect/>
-                    </a:stretch>
-                  </pic:blipFill>
-                  <pic:spPr>
-                    <a:xfrm>
-                      <a:off x="0" y="0"/>
-                      <a:ext cx="5493385" cy="3409950"/>
-                    </a:xfrm>
-                    <a:prstGeom prst="rect">
-                      <a:avLst/>
-                    </a:prstGeom>
-                  </pic:spPr>
-                </pic:pic>
-              </a:graphicData>
-            </a:graphic>
-          </wp:inline>
-        </w:drawing>
-      </w:r>
-    </w:p>
-    <w:p>
-      <w:pPr>
-        <w:ind w:left="715"/>
-      </w:pPr>
-      <w:r>
-        <w:softHyphen/>
-      </w:r>
-      <w:r>
-        <w:softHyphen/>
-      </w:r>
-    </w:p>
-    <w:p>
-      <w:pPr>
-        <w:ind w:left="715"/>
-      </w:pPr>
-      <w:r>
-        <w:rPr>
-          <w:b/>
-        </w:rPr>
-        <w:t>c. Halaman Upload Dokumen</w:t>
-      </w:r>
-    </w:p>
-    <w:p>
-      <w:pPr>
-        <w:ind w:left="715"/>
-      </w:pPr>
-      <w:r>
         <w:rPr>
           <w:i/>
-          <w:noProof/>
-        </w:rPr>
-        <w:lastRenderedPageBreak/>
-        <w:drawing>
-          <wp:inline distT="0" distB="0" distL="0" distR="0" wp14:anchorId="02411BA2" wp14:editId="671A1957">
-            <wp:extent cx="5493385" cy="1635125"/>
-            <wp:effectExtent l="0" t="0" r="0" b="3175"/>
-            <wp:docPr id="1" name="Picture 1"/>
-            <wp:cNvGraphicFramePr>
-              <a:graphicFrameLocks xmlns:a="http://schemas.openxmlformats.org/drawingml/2006/main" noChangeAspect="1"/>
-            </wp:cNvGraphicFramePr>
-            <a:graphic xmlns:a="http://schemas.openxmlformats.org/drawingml/2006/main">
-              <a:graphicData uri="http://schemas.openxmlformats.org/drawingml/2006/picture">
-                <pic:pic xmlns:pic="http://schemas.openxmlformats.org/drawingml/2006/picture">
-                  <pic:nvPicPr>
-                    <pic:cNvPr id="1" name=""/>
-                    <pic:cNvPicPr/>
-                  </pic:nvPicPr>
-                  <pic:blipFill>
-                    <a:blip r:embed="rId52"/>
-                    <a:stretch>
-                      <a:fillRect/>
-                    </a:stretch>
-                  </pic:blipFill>
-                  <pic:spPr>
-                    <a:xfrm>
-                      <a:off x="0" y="0"/>
-                      <a:ext cx="5493385" cy="1635125"/>
-                    </a:xfrm>
-                    <a:prstGeom prst="rect">
-                      <a:avLst/>
-                    </a:prstGeom>
-                  </pic:spPr>
-                </pic:pic>
-              </a:graphicData>
-            </a:graphic>
-          </wp:inline>
-        </w:drawing>
-      </w:r>
-    </w:p>
-    <w:p>
-      <w:pPr>
-        <w:ind w:left="715"/>
-        <w:rPr>
-          <w:lang w:val="en-US"/>
-        </w:rPr>
-      </w:pPr>
-      <w:r>
-        <w:rPr>
-          <w:b/>
-        </w:rPr>
-        <w:t>d. Halaman Pencarian/Daftar Dokumen</w:t>
-      </w:r>
-      <w:r>
-        <w:rPr>
-          <w:b/>
-          <w:lang w:val="en-US"/>
-        </w:rPr>
-        <w:t xml:space="preserve"> Perkara</w:t>
-      </w:r>
-    </w:p>
-    <w:p>
-      <w:pPr>
-        <w:ind w:left="715"/>
-      </w:pPr>
-      <w:r>
-        <w:rPr>
-          <w:i/>
-          <w:noProof/>
-        </w:rPr>
-        <w:drawing>
-          <wp:inline distT="0" distB="0" distL="0" distR="0" wp14:anchorId="0406CDC3" wp14:editId="60D96F8B">
-            <wp:extent cx="5493385" cy="2369185"/>
-            <wp:effectExtent l="0" t="0" r="0" b="0"/>
-            <wp:docPr id="21" name="Picture 21"/>
-            <wp:cNvGraphicFramePr>
-              <a:graphicFrameLocks xmlns:a="http://schemas.openxmlformats.org/drawingml/2006/main" noChangeAspect="1"/>
-            </wp:cNvGraphicFramePr>
-            <a:graphic xmlns:a="http://schemas.openxmlformats.org/drawingml/2006/main">
-              <a:graphicData uri="http://schemas.openxmlformats.org/drawingml/2006/picture">
-                <pic:pic xmlns:pic="http://schemas.openxmlformats.org/drawingml/2006/picture">
-                  <pic:nvPicPr>
-                    <pic:cNvPr id="1" name=""/>
-                    <pic:cNvPicPr/>
-                  </pic:nvPicPr>
-                  <pic:blipFill>
-                    <a:blip r:embed="rId53"/>
-                    <a:stretch>
-                      <a:fillRect/>
-                    </a:stretch>
-                  </pic:blipFill>
-                  <pic:spPr>
-                    <a:xfrm>
-                      <a:off x="0" y="0"/>
-                      <a:ext cx="5493385" cy="2369185"/>
-                    </a:xfrm>
-                    <a:prstGeom prst="rect">
-                      <a:avLst/>
-                    </a:prstGeom>
-                  </pic:spPr>
-                </pic:pic>
-              </a:graphicData>
-            </a:graphic>
-          </wp:inline>
-        </w:drawing>
-      </w:r>
-      <w:r>
-        <w:rPr>
-          <w:b/>
-        </w:rPr>
-        <w:t>e. Halaman Kelola Kategori dan Data Kasus</w:t>
-      </w:r>
-    </w:p>
-    <w:p>
-      <w:pPr>
-        <w:ind w:left="715"/>
-      </w:pPr>
-      <w:r>
-        <w:rPr>
-          <w:i/>
-          <w:noProof/>
-        </w:rPr>
-        <w:drawing>
-          <wp:inline distT="0" distB="0" distL="0" distR="0" wp14:anchorId="0671DB6B" wp14:editId="09F37206">
-            <wp:extent cx="5493385" cy="2369185"/>
-            <wp:effectExtent l="0" t="0" r="0" b="0"/>
-            <wp:docPr id="23" name="Picture 23"/>
-            <wp:cNvGraphicFramePr>
-              <a:graphicFrameLocks xmlns:a="http://schemas.openxmlformats.org/drawingml/2006/main" noChangeAspect="1"/>
-            </wp:cNvGraphicFramePr>
-            <a:graphic xmlns:a="http://schemas.openxmlformats.org/drawingml/2006/main">
-              <a:graphicData uri="http://schemas.openxmlformats.org/drawingml/2006/picture">
-                <pic:pic xmlns:pic="http://schemas.openxmlformats.org/drawingml/2006/picture">
-                  <pic:nvPicPr>
-                    <pic:cNvPr id="1" name=""/>
-                    <pic:cNvPicPr/>
-                  </pic:nvPicPr>
-                  <pic:blipFill>
-                    <a:blip r:embed="rId53"/>
-                    <a:stretch>
-                      <a:fillRect/>
-                    </a:stretch>
-                  </pic:blipFill>
-                  <pic:spPr>
-                    <a:xfrm>
-                      <a:off x="0" y="0"/>
-                      <a:ext cx="5493385" cy="2369185"/>
-                    </a:xfrm>
-                    <a:prstGeom prst="rect">
-                      <a:avLst/>
-                    </a:prstGeom>
-                  </pic:spPr>
-                </pic:pic>
-              </a:graphicData>
-            </a:graphic>
-          </wp:inline>
-        </w:drawing>
-      </w:r>
-      <w:r>
-        <w:rPr>
-          <w:b/>
-        </w:rPr>
-        <w:t>f. Halaman Laporan</w:t>
-      </w:r>
-    </w:p>
-    <w:p>
-      <w:r>
-        <w:rPr>
-          <w:i/>
-          <w:noProof/>
-        </w:rPr>
-        <w:lastRenderedPageBreak/>
-        <w:drawing>
-          <wp:inline distT="0" distB="0" distL="0" distR="0" wp14:anchorId="32EA126F" wp14:editId="30C04B8C">
-            <wp:extent cx="5493385" cy="2444115"/>
-            <wp:effectExtent l="0" t="0" r="0" b="0"/>
-            <wp:docPr id="22" name="Picture 22"/>
-            <wp:cNvGraphicFramePr>
-              <a:graphicFrameLocks xmlns:a="http://schemas.openxmlformats.org/drawingml/2006/main" noChangeAspect="1"/>
-            </wp:cNvGraphicFramePr>
-            <a:graphic xmlns:a="http://schemas.openxmlformats.org/drawingml/2006/main">
-              <a:graphicData uri="http://schemas.openxmlformats.org/drawingml/2006/picture">
-                <pic:pic xmlns:pic="http://schemas.openxmlformats.org/drawingml/2006/picture">
-                  <pic:nvPicPr>
-                    <pic:cNvPr id="1" name=""/>
-                    <pic:cNvPicPr/>
-                  </pic:nvPicPr>
-                  <pic:blipFill>
-                    <a:blip r:embed="rId54"/>
-                    <a:stretch>
-                      <a:fillRect/>
-                    </a:stretch>
-                  </pic:blipFill>
-                  <pic:spPr>
-                    <a:xfrm>
-                      <a:off x="0" y="0"/>
-                      <a:ext cx="5493385" cy="2444115"/>
-                    </a:xfrm>
-                    <a:prstGeom prst="rect">
-                      <a:avLst/>
-                    </a:prstGeom>
-                  </pic:spPr>
-                </pic:pic>
-              </a:graphicData>
-            </a:graphic>
-          </wp:inline>
-        </w:drawing>
-      </w:r>
-    </w:p>
+        </w:rPr>
+        <w:t>[Sisipkan screenshot halaman laporan di sini]</w:t>
+      </w:r>
+    </w:p>
+    <w:p/>
     <w:p>
       <w:pPr>
         <w:pStyle w:val="Heading2"/>
@@ -17239,6 +16381,7 @@
               <w:jc w:val="left"/>
             </w:pPr>
             <w:r>
+              <w:lastRenderedPageBreak/>
               <w:t>4</w:t>
             </w:r>
           </w:p>
@@ -17471,7 +16614,6 @@
               <w:jc w:val="left"/>
             </w:pPr>
             <w:r>
-              <w:lastRenderedPageBreak/>
               <w:t>8</w:t>
             </w:r>
           </w:p>
@@ -17643,6 +16785,7 @@
         <w:rPr>
           <w:noProof/>
         </w:rPr>
+        <w:lastRenderedPageBreak/>
         <w:drawing>
           <wp:inline distT="0" distB="0" distL="0" distR="0" wp14:anchorId="23A61B2F" wp14:editId="366D9964">
             <wp:extent cx="2974412" cy="5486400"/>
@@ -17659,7 +16802,7 @@
                     <pic:cNvPicPr/>
                   </pic:nvPicPr>
                   <pic:blipFill>
-                    <a:blip r:embed="rId55"/>
+                    <a:blip r:embed="rId48"/>
                     <a:stretch>
                       <a:fillRect/>
                     </a:stretch>
@@ -17697,7 +16840,6 @@
         <w:ind w:left="715"/>
       </w:pPr>
       <w:r>
-        <w:lastRenderedPageBreak/>
         <w:t>Berdasarkan flow graph di atas, diperoleh jumlah node (N) = 10, jumlah edge (E) = 12, dan jumlah region (P) = 1, sehingga nilai cyclomatic complexity dihitung dengan rumus:</w:t>
       </w:r>
     </w:p>
@@ -17916,6 +17058,7 @@
               <w:jc w:val="left"/>
             </w:pPr>
             <w:r>
+              <w:lastRenderedPageBreak/>
               <w:t>2</w:t>
             </w:r>
           </w:p>
@@ -18157,7 +17300,6 @@
       </w:pPr>
       <w:bookmarkStart w:id="53" w:name="_Toc235285004"/>
       <w:r>
-        <w:lastRenderedPageBreak/>
         <w:t>5.2 Saran</w:t>
       </w:r>
       <w:bookmarkEnd w:id="53"/>
@@ -18248,6 +17390,7 @@
         <w:rPr>
           <w:sz w:val="22"/>
         </w:rPr>
+        <w:lastRenderedPageBreak/>
         <w:t xml:space="preserve"> </w:t>
       </w:r>
     </w:p>
@@ -18684,15 +17827,7 @@
           <w:i/>
           <w:sz w:val="22"/>
         </w:rPr>
-        <w:t xml:space="preserve">[Catatan bagi penulis: referensi berikut masih dikutip di dalam teks (Munawar, 2015; Ramdany, 2024; McLeod, 2003; Kadir, 2003; Saputra, 2011) serta pada Tabel 2.1 penelitian terdahulu (A’lin Aminudin, 2023; Miftakhul Ula, 2024; Putu Ayu Baskara, 2023; Steven Martinus Pedro Pasaribu; Irmawan Setiawan &amp; Effiyaldi), namun belum dapat dipastikan </w:t>
-      </w:r>
-      <w:r>
-        <w:rPr>
-          <w:i/>
-          <w:sz w:val="22"/>
-        </w:rPr>
-        <w:lastRenderedPageBreak/>
-        <w:t>detail jurnal/penerbit dan halamannya secara akurat. Mohon lengkapi sendiri detail bibliografinya (nama jurnal/penerbit, volume, dan halaman) sesuai sumber asli yang digunakan, lalu urutkan seluruh Daftar Pustaka secara alfabetis.]</w:t>
+        <w:t>[Catatan bagi penulis: referensi berikut masih dikutip di dalam teks (Munawar, 2015; Ramdany, 2024; McLeod, 2003; Kadir, 2003; Saputra, 2011) serta pada Tabel 2.1 penelitian terdahulu (A’lin Aminudin, 2023; Miftakhul Ula, 2024; Putu Ayu Baskara, 2023; Steven Martinus Pedro Pasaribu; Irmawan Setiawan &amp; Effiyaldi), namun belum dapat dipastikan detail jurnal/penerbit dan halamannya secara akurat. Mohon lengkapi sendiri detail bibliografinya (nama jurnal/penerbit, volume, dan halaman) sesuai sumber asli yang digunakan, lalu urutkan seluruh Daftar Pustaka secara alfabetis.]</w:t>
       </w:r>
     </w:p>
     <w:p>
@@ -18852,6 +17987,7 @@
         <w:jc w:val="center"/>
       </w:pPr>
       <w:r>
+        <w:lastRenderedPageBreak/>
         <w:t xml:space="preserve"> </w:t>
       </w:r>
     </w:p>
@@ -19155,7 +18291,6 @@
         <w:jc w:val="left"/>
       </w:pPr>
       <w:r>
-        <w:lastRenderedPageBreak/>
         <w:t xml:space="preserve"> </w:t>
       </w:r>
     </w:p>
@@ -19336,6 +18471,7 @@
         <w:jc w:val="left"/>
       </w:pPr>
       <w:r>
+        <w:lastRenderedPageBreak/>
         <w:t xml:space="preserve"> </w:t>
       </w:r>
     </w:p>
@@ -19640,7 +18776,6 @@
         <w:jc w:val="left"/>
       </w:pPr>
       <w:r>
-        <w:lastRenderedPageBreak/>
         <w:t xml:space="preserve"> </w:t>
       </w:r>
     </w:p>
@@ -19694,6 +18829,7 @@
         <w:rPr>
           <w:sz w:val="22"/>
         </w:rPr>
+        <w:lastRenderedPageBreak/>
         <w:t>31</w:t>
       </w:r>
     </w:p>
@@ -19727,7 +18863,6 @@
         <w:jc w:val="left"/>
       </w:pPr>
       <w:r>
-        <w:lastRenderedPageBreak/>
         <w:t xml:space="preserve"> </w:t>
       </w:r>
     </w:p>
@@ -19845,12 +18980,12 @@
       </w:r>
     </w:p>
     <w:sectPr>
-      <w:headerReference w:type="even" r:id="rId56"/>
-      <w:headerReference w:type="default" r:id="rId57"/>
-      <w:footerReference w:type="even" r:id="rId58"/>
-      <w:footerReference w:type="default" r:id="rId59"/>
-      <w:headerReference w:type="first" r:id="rId60"/>
-      <w:footerReference w:type="first" r:id="rId61"/>
+      <w:headerReference w:type="even" r:id="rId49"/>
+      <w:headerReference w:type="default" r:id="rId50"/>
+      <w:footerReference w:type="even" r:id="rId51"/>
+      <w:footerReference w:type="default" r:id="rId52"/>
+      <w:headerReference w:type="first" r:id="rId53"/>
+      <w:footerReference w:type="first" r:id="rId54"/>
       <w:pgSz w:w="11911" w:h="16841"/>
       <w:pgMar w:top="51" w:right="1560" w:bottom="990" w:left="1700" w:header="720" w:footer="720" w:gutter="0"/>
       <w:cols w:space="720"/>

</xml_diff>